<commit_message>
Day 7: deepen Materi to the plan's Wissen (rule 2.17) with real findings
All 12 Wissen bullets are now full: Damasio, the peak-end study, ISO 9241-210 and Norman's levels,
Walter's hierarchy, Mailchimp's voice and tone guide, dark patterns at scale with the EU Digital
Services Act Article 25, and trust and competence findings. Day 7 added to verify:depth; Word
documents of Day 7 rebuilt.

Co-Authored-By: Claude Sonnet 5.5 <noreply@anthropic.com>
</commit_message>
<xml_diff>
--- a/docx/Day7-Materi-AION-UX-Developer-Emotional-bonding-in-design.docx
+++ b/docx/Day7-Materi-AION-UX-Developer-Emotional-bonding-in-design.docx
@@ -2830,6 +2830,319 @@
         <w:spacing w:before="0" w:after="80"/>
       </w:pPr>
     </w:p>
+    <w:p>
+      <w:pPr>
+        <w:spacing w:before="0" w:after="100"/>
+      </w:pPr>
+      <w:r>
+        <w:rPr>
+          <w:b/>
+        </w:rPr>
+        <w:t>What a feeling acts on: evidence</w:t>
+      </w:r>
+    </w:p>
+    <w:tbl>
+      <w:tblPr>
+        <w:tblW w:w="9638" w:type="dxa"/>
+        <w:tblBorders>
+          <w:top w:val="single" w:sz="4" w:space="0" w:color="D5DEE9"/>
+          <w:left w:val="single" w:sz="4" w:space="0" w:color="D5DEE9"/>
+          <w:bottom w:val="single" w:sz="4" w:space="0" w:color="D5DEE9"/>
+          <w:right w:val="single" w:sz="4" w:space="0" w:color="D5DEE9"/>
+          <w:insideH w:val="single" w:sz="4" w:space="0" w:color="D5DEE9"/>
+          <w:insideV w:val="single" w:sz="4" w:space="0" w:color="D5DEE9"/>
+        </w:tblBorders>
+        <w:tblLayout w:type="fixed"/>
+        <w:tblCellMar>
+          <w:top w:w="60" w:type="dxa"/>
+          <w:left w:w="100" w:type="dxa"/>
+          <w:bottom w:w="60" w:type="dxa"/>
+          <w:right w:w="100" w:type="dxa"/>
+        </w:tblCellMar>
+      </w:tblPr>
+      <w:tblGrid>
+        <w:gridCol w:w="1442"/>
+        <w:gridCol w:w="5092"/>
+        <w:gridCol w:w="3104"/>
+      </w:tblGrid>
+      <w:tr>
+        <w:trPr>
+          <w:cantSplit/>
+          <w:tblHeader/>
+        </w:trPr>
+        <w:tc>
+          <w:tcPr>
+            <w:tcW w:type="dxa" w:w="1442"/>
+            <w:shd w:val="clear" w:color="auto" w:fill="E6ECF4"/>
+          </w:tcPr>
+          <w:p>
+            <w:pPr>
+              <w:spacing w:before="0" w:after="0"/>
+            </w:pPr>
+            <w:r>
+              <w:rPr>
+                <w:b/>
+                <w:sz w:val="20"/>
+              </w:rPr>
+              <w:t>Effect</w:t>
+            </w:r>
+          </w:p>
+        </w:tc>
+        <w:tc>
+          <w:tcPr>
+            <w:tcW w:type="dxa" w:w="5092"/>
+            <w:shd w:val="clear" w:color="auto" w:fill="E6ECF4"/>
+          </w:tcPr>
+          <w:p>
+            <w:pPr>
+              <w:spacing w:before="0" w:after="0"/>
+            </w:pPr>
+            <w:r>
+              <w:rPr>
+                <w:b/>
+                <w:sz w:val="20"/>
+              </w:rPr>
+              <w:t>Real finding</w:t>
+            </w:r>
+          </w:p>
+        </w:tc>
+        <w:tc>
+          <w:tcPr>
+            <w:tcW w:type="dxa" w:w="3104"/>
+            <w:shd w:val="clear" w:color="auto" w:fill="E6ECF4"/>
+          </w:tcPr>
+          <w:p>
+            <w:pPr>
+              <w:spacing w:before="0" w:after="0"/>
+            </w:pPr>
+            <w:r>
+              <w:rPr>
+                <w:b/>
+                <w:sz w:val="20"/>
+              </w:rPr>
+              <w:t>What it means for a screen</w:t>
+            </w:r>
+          </w:p>
+        </w:tc>
+      </w:tr>
+      <w:tr>
+        <w:trPr>
+          <w:cantSplit/>
+        </w:trPr>
+        <w:tc>
+          <w:tcPr>
+            <w:tcW w:type="dxa" w:w="1442"/>
+          </w:tcPr>
+          <w:p>
+            <w:pPr>
+              <w:spacing w:before="0" w:after="0"/>
+            </w:pPr>
+            <w:r>
+              <w:rPr>
+                <w:sz w:val="20"/>
+              </w:rPr>
+              <w:t>Decisions</w:t>
+            </w:r>
+          </w:p>
+        </w:tc>
+        <w:tc>
+          <w:tcPr>
+            <w:tcW w:type="dxa" w:w="5092"/>
+          </w:tcPr>
+          <w:p>
+            <w:pPr>
+              <w:spacing w:before="0" w:after="0"/>
+            </w:pPr>
+            <w:r>
+              <w:rPr>
+                <w:sz w:val="20"/>
+              </w:rPr>
+              <w:t>Damasio described patients with damage to the part of the brain that links feeling to decision-making: their reasoning stayed intact, but their everyday decisions were poor (Damasio 1994).</w:t>
+            </w:r>
+          </w:p>
+        </w:tc>
+        <w:tc>
+          <w:tcPr>
+            <w:tcW w:type="dxa" w:w="3104"/>
+          </w:tcPr>
+          <w:p>
+            <w:pPr>
+              <w:spacing w:before="0" w:after="0"/>
+            </w:pPr>
+            <w:r>
+              <w:rPr>
+                <w:sz w:val="20"/>
+              </w:rPr>
+              <w:t>Feelings are part of how people decide, not noise around it; a screen that ignores them still has an effect.</w:t>
+            </w:r>
+          </w:p>
+        </w:tc>
+      </w:tr>
+      <w:tr>
+        <w:trPr>
+          <w:cantSplit/>
+        </w:trPr>
+        <w:tc>
+          <w:tcPr>
+            <w:tcW w:type="dxa" w:w="1442"/>
+          </w:tcPr>
+          <w:p>
+            <w:pPr>
+              <w:spacing w:before="0" w:after="0"/>
+            </w:pPr>
+            <w:r>
+              <w:rPr>
+                <w:sz w:val="20"/>
+              </w:rPr>
+              <w:t>Memory</w:t>
+            </w:r>
+          </w:p>
+        </w:tc>
+        <w:tc>
+          <w:tcPr>
+            <w:tcW w:type="dxa" w:w="5092"/>
+          </w:tcPr>
+          <w:p>
+            <w:pPr>
+              <w:spacing w:before="0" w:after="0"/>
+            </w:pPr>
+            <w:r>
+              <w:rPr>
+                <w:sz w:val="20"/>
+              </w:rPr>
+              <w:t>In a study with cold water, 22 of 32 participants (69%) chose to repeat a 90-second trial rather than a 60-second one, because it ended slightly warmer; the end of an episode weighs more than its length (Kahneman et al. 1993, as reported).</w:t>
+            </w:r>
+          </w:p>
+        </w:tc>
+        <w:tc>
+          <w:tcPr>
+            <w:tcW w:type="dxa" w:w="3104"/>
+          </w:tcPr>
+          <w:p>
+            <w:pPr>
+              <w:spacing w:before="0" w:after="0"/>
+            </w:pPr>
+            <w:r>
+              <w:rPr>
+                <w:sz w:val="20"/>
+              </w:rPr>
+              <w:t>Take care with the end of a visit: the confirmation and the last screen colour the whole memory.</w:t>
+            </w:r>
+          </w:p>
+        </w:tc>
+      </w:tr>
+      <w:tr>
+        <w:trPr>
+          <w:cantSplit/>
+        </w:trPr>
+        <w:tc>
+          <w:tcPr>
+            <w:tcW w:type="dxa" w:w="1442"/>
+          </w:tcPr>
+          <w:p>
+            <w:pPr>
+              <w:spacing w:before="0" w:after="0"/>
+            </w:pPr>
+            <w:r>
+              <w:rPr>
+                <w:sz w:val="20"/>
+              </w:rPr>
+              <w:t>Trust</w:t>
+            </w:r>
+          </w:p>
+        </w:tc>
+        <w:tc>
+          <w:tcPr>
+            <w:tcW w:type="dxa" w:w="5092"/>
+          </w:tcPr>
+          <w:p>
+            <w:pPr>
+              <w:spacing w:before="0" w:after="0"/>
+            </w:pPr>
+            <w:r>
+              <w:rPr>
+                <w:sz w:val="20"/>
+              </w:rPr>
+              <w:t>The design look was the factor named most often when 2,684 people judged the credibility of 100 websites, in 46.1% of their comments (Fogg et al. 2003).</w:t>
+            </w:r>
+          </w:p>
+        </w:tc>
+        <w:tc>
+          <w:tcPr>
+            <w:tcW w:type="dxa" w:w="3104"/>
+          </w:tcPr>
+          <w:p>
+            <w:pPr>
+              <w:spacing w:before="0" w:after="0"/>
+            </w:pPr>
+            <w:r>
+              <w:rPr>
+                <w:sz w:val="20"/>
+              </w:rPr>
+              <w:t>The look and the tone are read as signs of care before any content is judged.</w:t>
+            </w:r>
+          </w:p>
+        </w:tc>
+      </w:tr>
+      <w:tr>
+        <w:trPr>
+          <w:cantSplit/>
+        </w:trPr>
+        <w:tc>
+          <w:tcPr>
+            <w:tcW w:type="dxa" w:w="1442"/>
+          </w:tcPr>
+          <w:p>
+            <w:pPr>
+              <w:spacing w:before="0" w:after="0"/>
+            </w:pPr>
+            <w:r>
+              <w:rPr>
+                <w:sz w:val="20"/>
+              </w:rPr>
+              <w:t>Motivation</w:t>
+            </w:r>
+          </w:p>
+        </w:tc>
+        <w:tc>
+          <w:tcPr>
+            <w:tcW w:type="dxa" w:w="5092"/>
+          </w:tcPr>
+          <w:p>
+            <w:pPr>
+              <w:spacing w:before="0" w:after="0"/>
+            </w:pPr>
+            <w:r>
+              <w:rPr>
+                <w:sz w:val="20"/>
+              </w:rPr>
+              <w:t>Hassenzahl separates pragmatic quality, whether a product helps to reach a goal, from hedonic quality, whether it stimulates, expresses who one is and carries meaning (Hassenzahl 2010).</w:t>
+            </w:r>
+          </w:p>
+        </w:tc>
+        <w:tc>
+          <w:tcPr>
+            <w:tcW w:type="dxa" w:w="3104"/>
+          </w:tcPr>
+          <w:p>
+            <w:pPr>
+              <w:spacing w:before="0" w:after="0"/>
+            </w:pPr>
+            <w:r>
+              <w:rPr>
+                <w:sz w:val="20"/>
+              </w:rPr>
+              <w:t>A product that only works can be used and still be left; hedonic quality is part of why people return.</w:t>
+            </w:r>
+          </w:p>
+        </w:tc>
+      </w:tr>
+    </w:tbl>
+    <w:p>
+      <w:pPr>
+        <w:spacing w:before="0" w:after="80"/>
+      </w:pPr>
+    </w:p>
     <w:tbl>
       <w:tblPr>
         <w:tblW w:w="9598" w:type="dxa"/>
@@ -2879,7 +3192,7 @@
             </w:pPr>
             <w:r>
               <w:rPr/>
-              <w:t>Moss &amp; Pine, Hana, Jonas, Wanda and Bruno are made up for this example. The three levels of emotional design follow Norman (2004); emotion as part of reasoning follows Damasio (1994); the peak-end rule follows Kahneman et al. (1993).</w:t>
+              <w:t>Moss &amp; Pine, Hana, Jonas, Wanda and Bruno are made up for this example. The three levels of emotional design follow Norman (2004); emotion as part of reasoning follows Damasio (1994); the peak-end rule follows Kahneman et al. (1993). The findings in the table of real evidence are real research results, rules and cases; the sources are listed below.</w:t>
             </w:r>
           </w:p>
         </w:tc>
@@ -3068,7 +3381,7 @@
           <w:color w:val="556274"/>
           <w:sz w:val="18"/>
         </w:rPr>
-        <w:t>Norman 2004 · Damasio 1994 · Kahneman et al. 1993</w:t>
+        <w:t>Norman 2004 · Damasio 1994 · Kahneman et al. 1993 · Fogg et al. 2003 · Hassenzahl 2010</w:t>
       </w:r>
     </w:p>
     <w:p>
@@ -3667,6 +3980,266 @@
         <w:spacing w:before="0" w:after="80"/>
       </w:pPr>
     </w:p>
+    <w:p>
+      <w:pPr>
+        <w:spacing w:before="0" w:after="100"/>
+      </w:pPr>
+      <w:r>
+        <w:rPr>
+          <w:b/>
+        </w:rPr>
+        <w:t>Emotional factors in the definitions and models</w:t>
+      </w:r>
+    </w:p>
+    <w:tbl>
+      <w:tblPr>
+        <w:tblW w:w="9638" w:type="dxa"/>
+        <w:tblBorders>
+          <w:top w:val="single" w:sz="4" w:space="0" w:color="D5DEE9"/>
+          <w:left w:val="single" w:sz="4" w:space="0" w:color="D5DEE9"/>
+          <w:bottom w:val="single" w:sz="4" w:space="0" w:color="D5DEE9"/>
+          <w:right w:val="single" w:sz="4" w:space="0" w:color="D5DEE9"/>
+          <w:insideH w:val="single" w:sz="4" w:space="0" w:color="D5DEE9"/>
+          <w:insideV w:val="single" w:sz="4" w:space="0" w:color="D5DEE9"/>
+        </w:tblBorders>
+        <w:tblLayout w:type="fixed"/>
+        <w:tblCellMar>
+          <w:top w:w="60" w:type="dxa"/>
+          <w:left w:w="100" w:type="dxa"/>
+          <w:bottom w:w="60" w:type="dxa"/>
+          <w:right w:w="100" w:type="dxa"/>
+        </w:tblCellMar>
+      </w:tblPr>
+      <w:tblGrid>
+        <w:gridCol w:w="1669"/>
+        <w:gridCol w:w="4635"/>
+        <w:gridCol w:w="3334"/>
+      </w:tblGrid>
+      <w:tr>
+        <w:trPr>
+          <w:cantSplit/>
+          <w:tblHeader/>
+        </w:trPr>
+        <w:tc>
+          <w:tcPr>
+            <w:tcW w:type="dxa" w:w="1669"/>
+            <w:shd w:val="clear" w:color="auto" w:fill="E6ECF4"/>
+          </w:tcPr>
+          <w:p>
+            <w:pPr>
+              <w:spacing w:before="0" w:after="0"/>
+            </w:pPr>
+            <w:r>
+              <w:rPr>
+                <w:b/>
+                <w:sz w:val="20"/>
+              </w:rPr>
+              <w:t>Source</w:t>
+            </w:r>
+          </w:p>
+        </w:tc>
+        <w:tc>
+          <w:tcPr>
+            <w:tcW w:type="dxa" w:w="4635"/>
+            <w:shd w:val="clear" w:color="auto" w:fill="E6ECF4"/>
+          </w:tcPr>
+          <w:p>
+            <w:pPr>
+              <w:spacing w:before="0" w:after="0"/>
+            </w:pPr>
+            <w:r>
+              <w:rPr>
+                <w:b/>
+                <w:sz w:val="20"/>
+              </w:rPr>
+              <w:t>What it says</w:t>
+            </w:r>
+          </w:p>
+        </w:tc>
+        <w:tc>
+          <w:tcPr>
+            <w:tcW w:type="dxa" w:w="3334"/>
+            <w:shd w:val="clear" w:color="auto" w:fill="E6ECF4"/>
+          </w:tcPr>
+          <w:p>
+            <w:pPr>
+              <w:spacing w:before="0" w:after="0"/>
+            </w:pPr>
+            <w:r>
+              <w:rPr>
+                <w:b/>
+                <w:sz w:val="20"/>
+              </w:rPr>
+              <w:t>What it means for a screen</w:t>
+            </w:r>
+          </w:p>
+        </w:tc>
+      </w:tr>
+      <w:tr>
+        <w:trPr>
+          <w:cantSplit/>
+        </w:trPr>
+        <w:tc>
+          <w:tcPr>
+            <w:tcW w:type="dxa" w:w="1669"/>
+          </w:tcPr>
+          <w:p>
+            <w:pPr>
+              <w:spacing w:before="0" w:after="0"/>
+            </w:pPr>
+            <w:r>
+              <w:rPr>
+                <w:sz w:val="20"/>
+              </w:rPr>
+              <w:t>ISO 9241-210</w:t>
+            </w:r>
+          </w:p>
+        </w:tc>
+        <w:tc>
+          <w:tcPr>
+            <w:tcW w:type="dxa" w:w="4635"/>
+          </w:tcPr>
+          <w:p>
+            <w:pPr>
+              <w:spacing w:before="0" w:after="0"/>
+            </w:pPr>
+            <w:r>
+              <w:rPr>
+                <w:sz w:val="20"/>
+              </w:rPr>
+              <w:t>User experience covers the user's emotions, beliefs, preferences, perceptions and responses before, during and after use (ISO 9241-210).</w:t>
+            </w:r>
+          </w:p>
+        </w:tc>
+        <w:tc>
+          <w:tcPr>
+            <w:tcW w:type="dxa" w:w="3334"/>
+          </w:tcPr>
+          <w:p>
+            <w:pPr>
+              <w:spacing w:before="0" w:after="0"/>
+            </w:pPr>
+            <w:r>
+              <w:rPr>
+                <w:sz w:val="20"/>
+              </w:rPr>
+              <w:t>Emotion is part of the standard definition, so a UX review that skips it is incomplete.</w:t>
+            </w:r>
+          </w:p>
+        </w:tc>
+      </w:tr>
+      <w:tr>
+        <w:trPr>
+          <w:cantSplit/>
+        </w:trPr>
+        <w:tc>
+          <w:tcPr>
+            <w:tcW w:type="dxa" w:w="1669"/>
+          </w:tcPr>
+          <w:p>
+            <w:pPr>
+              <w:spacing w:before="0" w:after="0"/>
+            </w:pPr>
+            <w:r>
+              <w:rPr>
+                <w:sz w:val="20"/>
+              </w:rPr>
+              <w:t>Three levels (Norman 2004)</w:t>
+            </w:r>
+          </w:p>
+        </w:tc>
+        <w:tc>
+          <w:tcPr>
+            <w:tcW w:type="dxa" w:w="4635"/>
+          </w:tcPr>
+          <w:p>
+            <w:pPr>
+              <w:spacing w:before="0" w:after="0"/>
+            </w:pPr>
+            <w:r>
+              <w:rPr>
+                <w:sz w:val="20"/>
+              </w:rPr>
+              <w:t>Norman names a visceral level (the first look and feel), a behavioural level (how it works in use) and a reflective level (what it means afterwards).</w:t>
+            </w:r>
+          </w:p>
+        </w:tc>
+        <w:tc>
+          <w:tcPr>
+            <w:tcW w:type="dxa" w:w="3334"/>
+          </w:tcPr>
+          <w:p>
+            <w:pPr>
+              <w:spacing w:before="0" w:after="0"/>
+            </w:pPr>
+            <w:r>
+              <w:rPr>
+                <w:sz w:val="20"/>
+              </w:rPr>
+              <w:t>Check each level: first impression, use, and the story people tell later.</w:t>
+            </w:r>
+          </w:p>
+        </w:tc>
+      </w:tr>
+      <w:tr>
+        <w:trPr>
+          <w:cantSplit/>
+        </w:trPr>
+        <w:tc>
+          <w:tcPr>
+            <w:tcW w:type="dxa" w:w="1669"/>
+          </w:tcPr>
+          <w:p>
+            <w:pPr>
+              <w:spacing w:before="0" w:after="0"/>
+            </w:pPr>
+            <w:r>
+              <w:rPr>
+                <w:sz w:val="20"/>
+              </w:rPr>
+              <w:t>Pragmatic and hedonic quality</w:t>
+            </w:r>
+          </w:p>
+        </w:tc>
+        <w:tc>
+          <w:tcPr>
+            <w:tcW w:type="dxa" w:w="4635"/>
+          </w:tcPr>
+          <w:p>
+            <w:pPr>
+              <w:spacing w:before="0" w:after="0"/>
+            </w:pPr>
+            <w:r>
+              <w:rPr>
+                <w:sz w:val="20"/>
+              </w:rPr>
+              <w:t>Hassenzahl's model separates the quality of reaching goals from the quality of stimulation, identification and meaning (Hassenzahl 2010).</w:t>
+            </w:r>
+          </w:p>
+        </w:tc>
+        <w:tc>
+          <w:tcPr>
+            <w:tcW w:type="dxa" w:w="3334"/>
+          </w:tcPr>
+          <w:p>
+            <w:pPr>
+              <w:spacing w:before="0" w:after="0"/>
+            </w:pPr>
+            <w:r>
+              <w:rPr>
+                <w:sz w:val="20"/>
+              </w:rPr>
+              <w:t>Name which of the emotional factors (safety, control, joy, belonging, recognition) your measure is for.</w:t>
+            </w:r>
+          </w:p>
+        </w:tc>
+      </w:tr>
+    </w:tbl>
+    <w:p>
+      <w:pPr>
+        <w:spacing w:before="0" w:after="80"/>
+      </w:pPr>
+    </w:p>
     <w:tbl>
       <w:tblPr>
         <w:tblW w:w="9598" w:type="dxa"/>
@@ -3716,7 +4289,7 @@
             </w:pPr>
             <w:r>
               <w:rPr/>
-              <w:t>Moss &amp; Pine, Hana, Jonas, Wanda and Bruno are made up for this example. Experience beyond usability follows Hassenzahl (2010); user experience as perceptions and responses before, during and after use follows ISO 9241-210.</w:t>
+              <w:t>Moss &amp; Pine, Hana, Jonas, Wanda and Bruno are made up for this example. Experience beyond usability follows Hassenzahl (2010); user experience as perceptions and responses before, during and after use follows ISO 9241-210. The findings in the table of real evidence are real research results, rules and cases; the sources are listed below.</w:t>
             </w:r>
           </w:p>
         </w:tc>
@@ -4398,6 +4971,319 @@
         <w:spacing w:before="0" w:after="80"/>
       </w:pPr>
     </w:p>
+    <w:p>
+      <w:pPr>
+        <w:spacing w:before="0" w:after="100"/>
+      </w:pPr>
+      <w:r>
+        <w:rPr>
+          <w:b/>
+        </w:rPr>
+        <w:t>Where feelings come from: models and a real case</w:t>
+      </w:r>
+    </w:p>
+    <w:tbl>
+      <w:tblPr>
+        <w:tblW w:w="9638" w:type="dxa"/>
+        <w:tblBorders>
+          <w:top w:val="single" w:sz="4" w:space="0" w:color="D5DEE9"/>
+          <w:left w:val="single" w:sz="4" w:space="0" w:color="D5DEE9"/>
+          <w:bottom w:val="single" w:sz="4" w:space="0" w:color="D5DEE9"/>
+          <w:right w:val="single" w:sz="4" w:space="0" w:color="D5DEE9"/>
+          <w:insideH w:val="single" w:sz="4" w:space="0" w:color="D5DEE9"/>
+          <w:insideV w:val="single" w:sz="4" w:space="0" w:color="D5DEE9"/>
+        </w:tblBorders>
+        <w:tblLayout w:type="fixed"/>
+        <w:tblCellMar>
+          <w:top w:w="60" w:type="dxa"/>
+          <w:left w:w="100" w:type="dxa"/>
+          <w:bottom w:w="60" w:type="dxa"/>
+          <w:right w:w="100" w:type="dxa"/>
+        </w:tblCellMar>
+      </w:tblPr>
+      <w:tblGrid>
+        <w:gridCol w:w="1658"/>
+        <w:gridCol w:w="5037"/>
+        <w:gridCol w:w="2943"/>
+      </w:tblGrid>
+      <w:tr>
+        <w:trPr>
+          <w:cantSplit/>
+          <w:tblHeader/>
+        </w:trPr>
+        <w:tc>
+          <w:tcPr>
+            <w:tcW w:type="dxa" w:w="1658"/>
+            <w:shd w:val="clear" w:color="auto" w:fill="E6ECF4"/>
+          </w:tcPr>
+          <w:p>
+            <w:pPr>
+              <w:spacing w:before="0" w:after="0"/>
+            </w:pPr>
+            <w:r>
+              <w:rPr>
+                <w:b/>
+                <w:sz w:val="20"/>
+              </w:rPr>
+              <w:t>Source</w:t>
+            </w:r>
+          </w:p>
+        </w:tc>
+        <w:tc>
+          <w:tcPr>
+            <w:tcW w:type="dxa" w:w="5037"/>
+            <w:shd w:val="clear" w:color="auto" w:fill="E6ECF4"/>
+          </w:tcPr>
+          <w:p>
+            <w:pPr>
+              <w:spacing w:before="0" w:after="0"/>
+            </w:pPr>
+            <w:r>
+              <w:rPr>
+                <w:b/>
+                <w:sz w:val="20"/>
+              </w:rPr>
+              <w:t>Real finding or example</w:t>
+            </w:r>
+          </w:p>
+        </w:tc>
+        <w:tc>
+          <w:tcPr>
+            <w:tcW w:type="dxa" w:w="2943"/>
+            <w:shd w:val="clear" w:color="auto" w:fill="E6ECF4"/>
+          </w:tcPr>
+          <w:p>
+            <w:pPr>
+              <w:spacing w:before="0" w:after="0"/>
+            </w:pPr>
+            <w:r>
+              <w:rPr>
+                <w:b/>
+                <w:sz w:val="20"/>
+              </w:rPr>
+              <w:t>What it means for a screen</w:t>
+            </w:r>
+          </w:p>
+        </w:tc>
+      </w:tr>
+      <w:tr>
+        <w:trPr>
+          <w:cantSplit/>
+        </w:trPr>
+        <w:tc>
+          <w:tcPr>
+            <w:tcW w:type="dxa" w:w="1658"/>
+          </w:tcPr>
+          <w:p>
+            <w:pPr>
+              <w:spacing w:before="0" w:after="0"/>
+            </w:pPr>
+            <w:r>
+              <w:rPr>
+                <w:sz w:val="20"/>
+              </w:rPr>
+              <w:t>A hierarchy of needs</w:t>
+            </w:r>
+          </w:p>
+        </w:tc>
+        <w:tc>
+          <w:tcPr>
+            <w:tcW w:type="dxa" w:w="5037"/>
+          </w:tcPr>
+          <w:p>
+            <w:pPr>
+              <w:spacing w:before="0" w:after="0"/>
+            </w:pPr>
+            <w:r>
+              <w:rPr>
+                <w:sz w:val="20"/>
+              </w:rPr>
+              <w:t>Walter ordered the needs of users as functional, reliable, usable, pleasurable and meaningful; pleasure is built on a product that works (Walter 2011).</w:t>
+            </w:r>
+          </w:p>
+        </w:tc>
+        <w:tc>
+          <w:tcPr>
+            <w:tcW w:type="dxa" w:w="2943"/>
+          </w:tcPr>
+          <w:p>
+            <w:pPr>
+              <w:spacing w:before="0" w:after="0"/>
+            </w:pPr>
+            <w:r>
+              <w:rPr>
+                <w:sz w:val="20"/>
+              </w:rPr>
+              <w:t>Fix what fails before adding delight.</w:t>
+            </w:r>
+          </w:p>
+        </w:tc>
+      </w:tr>
+      <w:tr>
+        <w:trPr>
+          <w:cantSplit/>
+        </w:trPr>
+        <w:tc>
+          <w:tcPr>
+            <w:tcW w:type="dxa" w:w="1658"/>
+          </w:tcPr>
+          <w:p>
+            <w:pPr>
+              <w:spacing w:before="0" w:after="0"/>
+            </w:pPr>
+            <w:r>
+              <w:rPr>
+                <w:sz w:val="20"/>
+              </w:rPr>
+              <w:t>Tone follows the reader</w:t>
+            </w:r>
+          </w:p>
+        </w:tc>
+        <w:tc>
+          <w:tcPr>
+            <w:tcW w:type="dxa" w:w="5037"/>
+          </w:tcPr>
+          <w:p>
+            <w:pPr>
+              <w:spacing w:before="0" w:after="0"/>
+            </w:pPr>
+            <w:r>
+              <w:rPr>
+                <w:sz w:val="20"/>
+              </w:rPr>
+              <w:t>Mailchimp's content guide keeps its voice steady and lets its tone change with the situation: you would not speak in the same tone to someone who is upset as to someone who is laughing (Mailchimp, Voice and Tone).</w:t>
+            </w:r>
+          </w:p>
+        </w:tc>
+        <w:tc>
+          <w:tcPr>
+            <w:tcW w:type="dxa" w:w="2943"/>
+          </w:tcPr>
+          <w:p>
+            <w:pPr>
+              <w:spacing w:before="0" w:after="0"/>
+            </w:pPr>
+            <w:r>
+              <w:rPr>
+                <w:sz w:val="20"/>
+              </w:rPr>
+              <w:t>Write a tone guide by situation: success, error, waiting, money.</w:t>
+            </w:r>
+          </w:p>
+        </w:tc>
+      </w:tr>
+      <w:tr>
+        <w:trPr>
+          <w:cantSplit/>
+        </w:trPr>
+        <w:tc>
+          <w:tcPr>
+            <w:tcW w:type="dxa" w:w="1658"/>
+          </w:tcPr>
+          <w:p>
+            <w:pPr>
+              <w:spacing w:before="0" w:after="0"/>
+            </w:pPr>
+            <w:r>
+              <w:rPr>
+                <w:sz w:val="20"/>
+              </w:rPr>
+              <w:t>Feedback and control</w:t>
+            </w:r>
+          </w:p>
+        </w:tc>
+        <w:tc>
+          <w:tcPr>
+            <w:tcW w:type="dxa" w:w="5037"/>
+          </w:tcPr>
+          <w:p>
+            <w:pPr>
+              <w:spacing w:before="0" w:after="0"/>
+            </w:pPr>
+            <w:r>
+              <w:rPr>
+                <w:sz w:val="20"/>
+              </w:rPr>
+              <w:t>One of the ten heuristics asks that the system always tells users what is going on, through appropriate feedback within a reasonable time (Nielsen 1994).</w:t>
+            </w:r>
+          </w:p>
+        </w:tc>
+        <w:tc>
+          <w:tcPr>
+            <w:tcW w:type="dxa" w:w="2943"/>
+          </w:tcPr>
+          <w:p>
+            <w:pPr>
+              <w:spacing w:before="0" w:after="0"/>
+            </w:pPr>
+            <w:r>
+              <w:rPr>
+                <w:sz w:val="20"/>
+              </w:rPr>
+              <w:t>Each action gets a clear answer: what happened and what comes next.</w:t>
+            </w:r>
+          </w:p>
+        </w:tc>
+      </w:tr>
+      <w:tr>
+        <w:trPr>
+          <w:cantSplit/>
+        </w:trPr>
+        <w:tc>
+          <w:tcPr>
+            <w:tcW w:type="dxa" w:w="1658"/>
+          </w:tcPr>
+          <w:p>
+            <w:pPr>
+              <w:spacing w:before="0" w:after="0"/>
+            </w:pPr>
+            <w:r>
+              <w:rPr>
+                <w:sz w:val="20"/>
+              </w:rPr>
+              <w:t>The end counts</w:t>
+            </w:r>
+          </w:p>
+        </w:tc>
+        <w:tc>
+          <w:tcPr>
+            <w:tcW w:type="dxa" w:w="5037"/>
+          </w:tcPr>
+          <w:p>
+            <w:pPr>
+              <w:spacing w:before="0" w:after="0"/>
+            </w:pPr>
+            <w:r>
+              <w:rPr>
+                <w:sz w:val="20"/>
+              </w:rPr>
+              <w:t>The end of an episode weighs more than its length in the memory of it (Kahneman et al. 1993, as reported).</w:t>
+            </w:r>
+          </w:p>
+        </w:tc>
+        <w:tc>
+          <w:tcPr>
+            <w:tcW w:type="dxa" w:w="2943"/>
+          </w:tcPr>
+          <w:p>
+            <w:pPr>
+              <w:spacing w:before="0" w:after="0"/>
+            </w:pPr>
+            <w:r>
+              <w:rPr>
+                <w:sz w:val="20"/>
+              </w:rPr>
+              <w:t>Make the last step of a task a calm, clear confirmation.</w:t>
+            </w:r>
+          </w:p>
+        </w:tc>
+      </w:tr>
+    </w:tbl>
+    <w:p>
+      <w:pPr>
+        <w:spacing w:before="0" w:after="80"/>
+      </w:pPr>
+    </w:p>
     <w:tbl>
       <w:tblPr>
         <w:tblW w:w="9598" w:type="dxa"/>
@@ -4447,7 +5333,7 @@
             </w:pPr>
             <w:r>
               <w:rPr/>
-              <w:t>Moss &amp; Pine, Hana, Jonas, Wanda and Bruno are made up for this example. Tone and personality in interfaces follow Walter (2011); visibility of system status and helpful error messages are Nielsen's heuristics (1994); feedback as a basic design principle follows Norman (2013).</w:t>
+              <w:t>Moss &amp; Pine, Hana, Jonas, Wanda and Bruno are made up for this example. Tone and personality in interfaces follow Walter (2011); visibility of system status and helpful error messages are Nielsen's heuristics (1994); feedback as a basic design principle follows Norman (2013). The findings in the table of real evidence are real research results, rules and cases; the sources are listed below.</w:t>
             </w:r>
           </w:p>
         </w:tc>
@@ -4636,7 +5522,7 @@
           <w:color w:val="556274"/>
           <w:sz w:val="18"/>
         </w:rPr>
-        <w:t>Walter 2011 · Norman 2013 · Nielsen 1994</w:t>
+        <w:t>Walter 2011 · Norman 2013 · Nielsen 1994 · Mailchimp, Voice and Tone · Kahneman et al. 1993</w:t>
       </w:r>
     </w:p>
     <w:p>
@@ -5129,6 +6015,319 @@
         <w:spacing w:before="0" w:after="80"/>
       </w:pPr>
     </w:p>
+    <w:p>
+      <w:pPr>
+        <w:spacing w:before="0" w:after="100"/>
+      </w:pPr>
+      <w:r>
+        <w:rPr>
+          <w:b/>
+        </w:rPr>
+        <w:t>When emotion turns against use: real findings</w:t>
+      </w:r>
+    </w:p>
+    <w:tbl>
+      <w:tblPr>
+        <w:tblW w:w="9638" w:type="dxa"/>
+        <w:tblBorders>
+          <w:top w:val="single" w:sz="4" w:space="0" w:color="D5DEE9"/>
+          <w:left w:val="single" w:sz="4" w:space="0" w:color="D5DEE9"/>
+          <w:bottom w:val="single" w:sz="4" w:space="0" w:color="D5DEE9"/>
+          <w:right w:val="single" w:sz="4" w:space="0" w:color="D5DEE9"/>
+          <w:insideH w:val="single" w:sz="4" w:space="0" w:color="D5DEE9"/>
+          <w:insideV w:val="single" w:sz="4" w:space="0" w:color="D5DEE9"/>
+        </w:tblBorders>
+        <w:tblLayout w:type="fixed"/>
+        <w:tblCellMar>
+          <w:top w:w="60" w:type="dxa"/>
+          <w:left w:w="100" w:type="dxa"/>
+          <w:bottom w:w="60" w:type="dxa"/>
+          <w:right w:w="100" w:type="dxa"/>
+        </w:tblCellMar>
+      </w:tblPr>
+      <w:tblGrid>
+        <w:gridCol w:w="1734"/>
+        <w:gridCol w:w="4730"/>
+        <w:gridCol w:w="3174"/>
+      </w:tblGrid>
+      <w:tr>
+        <w:trPr>
+          <w:cantSplit/>
+          <w:tblHeader/>
+        </w:trPr>
+        <w:tc>
+          <w:tcPr>
+            <w:tcW w:type="dxa" w:w="1734"/>
+            <w:shd w:val="clear" w:color="auto" w:fill="E6ECF4"/>
+          </w:tcPr>
+          <w:p>
+            <w:pPr>
+              <w:spacing w:before="0" w:after="0"/>
+            </w:pPr>
+            <w:r>
+              <w:rPr>
+                <w:b/>
+                <w:sz w:val="20"/>
+              </w:rPr>
+              <w:t>Finding</w:t>
+            </w:r>
+          </w:p>
+        </w:tc>
+        <w:tc>
+          <w:tcPr>
+            <w:tcW w:type="dxa" w:w="4730"/>
+            <w:shd w:val="clear" w:color="auto" w:fill="E6ECF4"/>
+          </w:tcPr>
+          <w:p>
+            <w:pPr>
+              <w:spacing w:before="0" w:after="0"/>
+            </w:pPr>
+            <w:r>
+              <w:rPr>
+                <w:b/>
+                <w:sz w:val="20"/>
+              </w:rPr>
+              <w:t>What was measured</w:t>
+            </w:r>
+          </w:p>
+        </w:tc>
+        <w:tc>
+          <w:tcPr>
+            <w:tcW w:type="dxa" w:w="3174"/>
+            <w:shd w:val="clear" w:color="auto" w:fill="E6ECF4"/>
+          </w:tcPr>
+          <w:p>
+            <w:pPr>
+              <w:spacing w:before="0" w:after="0"/>
+            </w:pPr>
+            <w:r>
+              <w:rPr>
+                <w:b/>
+                <w:sz w:val="20"/>
+              </w:rPr>
+              <w:t>What it means for a screen</w:t>
+            </w:r>
+          </w:p>
+        </w:tc>
+      </w:tr>
+      <w:tr>
+        <w:trPr>
+          <w:cantSplit/>
+        </w:trPr>
+        <w:tc>
+          <w:tcPr>
+            <w:tcW w:type="dxa" w:w="1734"/>
+          </w:tcPr>
+          <w:p>
+            <w:pPr>
+              <w:spacing w:before="0" w:after="0"/>
+            </w:pPr>
+            <w:r>
+              <w:rPr>
+                <w:sz w:val="20"/>
+              </w:rPr>
+              <w:t>Dark patterns at scale</w:t>
+            </w:r>
+          </w:p>
+        </w:tc>
+        <w:tc>
+          <w:tcPr>
+            <w:tcW w:type="dxa" w:w="4730"/>
+          </w:tcPr>
+          <w:p>
+            <w:pPr>
+              <w:spacing w:before="0" w:after="0"/>
+            </w:pPr>
+            <w:r>
+              <w:rPr>
+                <w:sz w:val="20"/>
+              </w:rPr>
+              <w:t>A crawl of about 11,000 shopping websites found 1,818 instances of dark patterns, of 15 types in 7 categories, on 1,254 websites (about 11.1%); some, such as countdown timers and low-stock messages, work through false urgency and scarcity (Mathur et al. 2019).</w:t>
+            </w:r>
+          </w:p>
+        </w:tc>
+        <w:tc>
+          <w:tcPr>
+            <w:tcW w:type="dxa" w:w="3174"/>
+          </w:tcPr>
+          <w:p>
+            <w:pPr>
+              <w:spacing w:before="0" w:after="0"/>
+            </w:pPr>
+            <w:r>
+              <w:rPr>
+                <w:sz w:val="20"/>
+              </w:rPr>
+              <w:t>Pressure and guilt sell in the short term; people who learn they were pushed stop trusting.</w:t>
+            </w:r>
+          </w:p>
+        </w:tc>
+      </w:tr>
+      <w:tr>
+        <w:trPr>
+          <w:cantSplit/>
+        </w:trPr>
+        <w:tc>
+          <w:tcPr>
+            <w:tcW w:type="dxa" w:w="1734"/>
+          </w:tcPr>
+          <w:p>
+            <w:pPr>
+              <w:spacing w:before="0" w:after="0"/>
+            </w:pPr>
+            <w:r>
+              <w:rPr>
+                <w:sz w:val="20"/>
+              </w:rPr>
+              <w:t>Sold as a service</w:t>
+            </w:r>
+          </w:p>
+        </w:tc>
+        <w:tc>
+          <w:tcPr>
+            <w:tcW w:type="dxa" w:w="4730"/>
+          </w:tcPr>
+          <w:p>
+            <w:pPr>
+              <w:spacing w:before="0" w:after="0"/>
+            </w:pPr>
+            <w:r>
+              <w:rPr>
+                <w:sz w:val="20"/>
+              </w:rPr>
+              <w:t>The same study identified 22 third parties that offer dark patterns to shops as a ready-made feature (Mathur et al. 2019).</w:t>
+            </w:r>
+          </w:p>
+        </w:tc>
+        <w:tc>
+          <w:tcPr>
+            <w:tcW w:type="dxa" w:w="3174"/>
+          </w:tcPr>
+          <w:p>
+            <w:pPr>
+              <w:spacing w:before="0" w:after="0"/>
+            </w:pPr>
+            <w:r>
+              <w:rPr>
+                <w:sz w:val="20"/>
+              </w:rPr>
+              <w:t>A team can adopt manipulation by installing a plug-in without noticing.</w:t>
+            </w:r>
+          </w:p>
+        </w:tc>
+      </w:tr>
+      <w:tr>
+        <w:trPr>
+          <w:cantSplit/>
+        </w:trPr>
+        <w:tc>
+          <w:tcPr>
+            <w:tcW w:type="dxa" w:w="1734"/>
+          </w:tcPr>
+          <w:p>
+            <w:pPr>
+              <w:spacing w:before="0" w:after="0"/>
+            </w:pPr>
+            <w:r>
+              <w:rPr>
+                <w:sz w:val="20"/>
+              </w:rPr>
+              <w:t>The legal line</w:t>
+            </w:r>
+          </w:p>
+        </w:tc>
+        <w:tc>
+          <w:tcPr>
+            <w:tcW w:type="dxa" w:w="4730"/>
+          </w:tcPr>
+          <w:p>
+            <w:pPr>
+              <w:spacing w:before="0" w:after="0"/>
+            </w:pPr>
+            <w:r>
+              <w:rPr>
+                <w:sz w:val="20"/>
+              </w:rPr>
+              <w:t>The EU Digital Services Act (Article 25) forbids online platforms to design interfaces that deceive or manipulate users, and the Court of Justice ruled in Planet49 (2019) that a pre-ticked box is not valid consent.</w:t>
+            </w:r>
+          </w:p>
+        </w:tc>
+        <w:tc>
+          <w:tcPr>
+            <w:tcW w:type="dxa" w:w="3174"/>
+          </w:tcPr>
+          <w:p>
+            <w:pPr>
+              <w:spacing w:before="0" w:after="0"/>
+            </w:pPr>
+            <w:r>
+              <w:rPr>
+                <w:sz w:val="20"/>
+              </w:rPr>
+              <w:t>Emotional pressure that works against the person's interest is a legal risk, not only an ethical one.</w:t>
+            </w:r>
+          </w:p>
+        </w:tc>
+      </w:tr>
+      <w:tr>
+        <w:trPr>
+          <w:cantSplit/>
+        </w:trPr>
+        <w:tc>
+          <w:tcPr>
+            <w:tcW w:type="dxa" w:w="1734"/>
+          </w:tcPr>
+          <w:p>
+            <w:pPr>
+              <w:spacing w:before="0" w:after="0"/>
+            </w:pPr>
+            <w:r>
+              <w:rPr>
+                <w:sz w:val="20"/>
+              </w:rPr>
+              <w:t>Credibility</w:t>
+            </w:r>
+          </w:p>
+        </w:tc>
+        <w:tc>
+          <w:tcPr>
+            <w:tcW w:type="dxa" w:w="4730"/>
+          </w:tcPr>
+          <w:p>
+            <w:pPr>
+              <w:spacing w:before="0" w:after="0"/>
+            </w:pPr>
+            <w:r>
+              <w:rPr>
+                <w:sz w:val="20"/>
+              </w:rPr>
+              <w:t>Credibility is judged from the elements people notice and how they interpret them (Fogg 2003).</w:t>
+            </w:r>
+          </w:p>
+        </w:tc>
+        <w:tc>
+          <w:tcPr>
+            <w:tcW w:type="dxa" w:w="3174"/>
+          </w:tcPr>
+          <w:p>
+            <w:pPr>
+              <w:spacing w:before="0" w:after="0"/>
+            </w:pPr>
+            <w:r>
+              <w:rPr>
+                <w:sz w:val="20"/>
+              </w:rPr>
+              <w:t>An exaggerated message looks less credible: match the feeling to the situation.</w:t>
+            </w:r>
+          </w:p>
+        </w:tc>
+      </w:tr>
+    </w:tbl>
+    <w:p>
+      <w:pPr>
+        <w:spacing w:before="0" w:after="80"/>
+      </w:pPr>
+    </w:p>
     <w:tbl>
       <w:tblPr>
         <w:tblW w:w="9598" w:type="dxa"/>
@@ -5178,7 +6377,7 @@
             </w:pPr>
             <w:r>
               <w:rPr/>
-              <w:t>Moss &amp; Pine, Hana, Jonas, Wanda and Bruno are made up for this example. False urgency, scarcity and confirmshaming as dark patterns follow Mathur et al. (2019); the ethics of persuasive technology follow Fogg (2003).</w:t>
+              <w:t>Moss &amp; Pine, Hana, Jonas, Wanda and Bruno are made up for this example. False urgency, scarcity and confirmshaming as dark patterns follow Mathur et al. (2019); the ethics of persuasive technology follow Fogg (2003). The findings in the table of real evidence are real research results, rules and cases; the sources are listed below.</w:t>
             </w:r>
           </w:p>
         </w:tc>
@@ -5367,7 +6566,7 @@
           <w:color w:val="556274"/>
           <w:sz w:val="18"/>
         </w:rPr>
-        <w:t>Mathur et al. 2019 · Fogg 2003 · Walter 2011</w:t>
+        <w:t>Mathur et al. 2019 · Fogg 2003 · Walter 2011 · EU Digital Services Act · CJEU Planet49 2019</w:t>
       </w:r>
     </w:p>
     <w:p>
@@ -5602,6 +6801,319 @@
         <w:t>Figure 6 · Moss &amp; Pine weighs three measures on effect on users, feasibility, risk and time pressure.</w:t>
       </w:r>
     </w:p>
+    <w:p>
+      <w:pPr>
+        <w:spacing w:before="0" w:after="100"/>
+      </w:pPr>
+      <w:r>
+        <w:rPr>
+          <w:b/>
+        </w:rPr>
+        <w:t>Trust and perceived competence: findings</w:t>
+      </w:r>
+    </w:p>
+    <w:tbl>
+      <w:tblPr>
+        <w:tblW w:w="9638" w:type="dxa"/>
+        <w:tblBorders>
+          <w:top w:val="single" w:sz="4" w:space="0" w:color="D5DEE9"/>
+          <w:left w:val="single" w:sz="4" w:space="0" w:color="D5DEE9"/>
+          <w:bottom w:val="single" w:sz="4" w:space="0" w:color="D5DEE9"/>
+          <w:right w:val="single" w:sz="4" w:space="0" w:color="D5DEE9"/>
+          <w:insideH w:val="single" w:sz="4" w:space="0" w:color="D5DEE9"/>
+          <w:insideV w:val="single" w:sz="4" w:space="0" w:color="D5DEE9"/>
+        </w:tblBorders>
+        <w:tblLayout w:type="fixed"/>
+        <w:tblCellMar>
+          <w:top w:w="60" w:type="dxa"/>
+          <w:left w:w="100" w:type="dxa"/>
+          <w:bottom w:w="60" w:type="dxa"/>
+          <w:right w:w="100" w:type="dxa"/>
+        </w:tblCellMar>
+      </w:tblPr>
+      <w:tblGrid>
+        <w:gridCol w:w="1857"/>
+        <w:gridCol w:w="4365"/>
+        <w:gridCol w:w="3416"/>
+      </w:tblGrid>
+      <w:tr>
+        <w:trPr>
+          <w:cantSplit/>
+          <w:tblHeader/>
+        </w:trPr>
+        <w:tc>
+          <w:tcPr>
+            <w:tcW w:type="dxa" w:w="1857"/>
+            <w:shd w:val="clear" w:color="auto" w:fill="E6ECF4"/>
+          </w:tcPr>
+          <w:p>
+            <w:pPr>
+              <w:spacing w:before="0" w:after="0"/>
+            </w:pPr>
+            <w:r>
+              <w:rPr>
+                <w:b/>
+                <w:sz w:val="20"/>
+              </w:rPr>
+              <w:t>Finding</w:t>
+            </w:r>
+          </w:p>
+        </w:tc>
+        <w:tc>
+          <w:tcPr>
+            <w:tcW w:type="dxa" w:w="4365"/>
+            <w:shd w:val="clear" w:color="auto" w:fill="E6ECF4"/>
+          </w:tcPr>
+          <w:p>
+            <w:pPr>
+              <w:spacing w:before="0" w:after="0"/>
+            </w:pPr>
+            <w:r>
+              <w:rPr>
+                <w:b/>
+                <w:sz w:val="20"/>
+              </w:rPr>
+              <w:t>What was measured</w:t>
+            </w:r>
+          </w:p>
+        </w:tc>
+        <w:tc>
+          <w:tcPr>
+            <w:tcW w:type="dxa" w:w="3416"/>
+            <w:shd w:val="clear" w:color="auto" w:fill="E6ECF4"/>
+          </w:tcPr>
+          <w:p>
+            <w:pPr>
+              <w:spacing w:before="0" w:after="0"/>
+            </w:pPr>
+            <w:r>
+              <w:rPr>
+                <w:b/>
+                <w:sz w:val="20"/>
+              </w:rPr>
+              <w:t>What it means for a measure</w:t>
+            </w:r>
+          </w:p>
+        </w:tc>
+      </w:tr>
+      <w:tr>
+        <w:trPr>
+          <w:cantSplit/>
+        </w:trPr>
+        <w:tc>
+          <w:tcPr>
+            <w:tcW w:type="dxa" w:w="1857"/>
+          </w:tcPr>
+          <w:p>
+            <w:pPr>
+              <w:spacing w:before="0" w:after="0"/>
+            </w:pPr>
+            <w:r>
+              <w:rPr>
+                <w:sz w:val="20"/>
+              </w:rPr>
+              <w:t>Speed of judgement</w:t>
+            </w:r>
+          </w:p>
+        </w:tc>
+        <w:tc>
+          <w:tcPr>
+            <w:tcW w:type="dxa" w:w="4365"/>
+          </w:tcPr>
+          <w:p>
+            <w:pPr>
+              <w:spacing w:before="0" w:after="0"/>
+            </w:pPr>
+            <w:r>
+              <w:rPr>
+                <w:sz w:val="20"/>
+              </w:rPr>
+              <w:t>People rate the appeal of a web page after 50 ms (Lindgaard et al. 2006).</w:t>
+            </w:r>
+          </w:p>
+        </w:tc>
+        <w:tc>
+          <w:tcPr>
+            <w:tcW w:type="dxa" w:w="3416"/>
+          </w:tcPr>
+          <w:p>
+            <w:pPr>
+              <w:spacing w:before="0" w:after="0"/>
+            </w:pPr>
+            <w:r>
+              <w:rPr>
+                <w:sz w:val="20"/>
+              </w:rPr>
+              <w:t>The first feeling of competence is formed before anything is read.</w:t>
+            </w:r>
+          </w:p>
+        </w:tc>
+      </w:tr>
+      <w:tr>
+        <w:trPr>
+          <w:cantSplit/>
+        </w:trPr>
+        <w:tc>
+          <w:tcPr>
+            <w:tcW w:type="dxa" w:w="1857"/>
+          </w:tcPr>
+          <w:p>
+            <w:pPr>
+              <w:spacing w:before="0" w:after="0"/>
+            </w:pPr>
+            <w:r>
+              <w:rPr>
+                <w:sz w:val="20"/>
+              </w:rPr>
+              <w:t>Design and rejection</w:t>
+            </w:r>
+          </w:p>
+        </w:tc>
+        <w:tc>
+          <w:tcPr>
+            <w:tcW w:type="dxa" w:w="4365"/>
+          </w:tcPr>
+          <w:p>
+            <w:pPr>
+              <w:spacing w:before="0" w:after="0"/>
+            </w:pPr>
+            <w:r>
+              <w:rPr>
+                <w:sz w:val="20"/>
+              </w:rPr>
+              <w:t>In a four-week study, women searching for health advice rejected sites because of their design appeal, and chose sites for the credibility of the content (Sillence et al. 2004).</w:t>
+            </w:r>
+          </w:p>
+        </w:tc>
+        <w:tc>
+          <w:tcPr>
+            <w:tcW w:type="dxa" w:w="3416"/>
+          </w:tcPr>
+          <w:p>
+            <w:pPr>
+              <w:spacing w:before="0" w:after="0"/>
+            </w:pPr>
+            <w:r>
+              <w:rPr>
+                <w:sz w:val="20"/>
+              </w:rPr>
+              <w:t>Design earns the right to be read; content earns the trust.</w:t>
+            </w:r>
+          </w:p>
+        </w:tc>
+      </w:tr>
+      <w:tr>
+        <w:trPr>
+          <w:cantSplit/>
+        </w:trPr>
+        <w:tc>
+          <w:tcPr>
+            <w:tcW w:type="dxa" w:w="1857"/>
+          </w:tcPr>
+          <w:p>
+            <w:pPr>
+              <w:spacing w:before="0" w:after="0"/>
+            </w:pPr>
+            <w:r>
+              <w:rPr>
+                <w:sz w:val="20"/>
+              </w:rPr>
+              <w:t>Beauty and ease</w:t>
+            </w:r>
+          </w:p>
+        </w:tc>
+        <w:tc>
+          <w:tcPr>
+            <w:tcW w:type="dxa" w:w="4365"/>
+          </w:tcPr>
+          <w:p>
+            <w:pPr>
+              <w:spacing w:before="0" w:after="0"/>
+            </w:pPr>
+            <w:r>
+              <w:rPr>
+                <w:sz w:val="20"/>
+              </w:rPr>
+              <w:t>People rate an attractive interface as easier to use before they have used it (Tractinsky et al. 2000).</w:t>
+            </w:r>
+          </w:p>
+        </w:tc>
+        <w:tc>
+          <w:tcPr>
+            <w:tcW w:type="dxa" w:w="3416"/>
+          </w:tcPr>
+          <w:p>
+            <w:pPr>
+              <w:spacing w:before="0" w:after="0"/>
+            </w:pPr>
+            <w:r>
+              <w:rPr>
+                <w:sz w:val="20"/>
+              </w:rPr>
+              <w:t>A polished look raises expectations: the interface must live up to them.</w:t>
+            </w:r>
+          </w:p>
+        </w:tc>
+      </w:tr>
+      <w:tr>
+        <w:trPr>
+          <w:cantSplit/>
+        </w:trPr>
+        <w:tc>
+          <w:tcPr>
+            <w:tcW w:type="dxa" w:w="1857"/>
+          </w:tcPr>
+          <w:p>
+            <w:pPr>
+              <w:spacing w:before="0" w:after="0"/>
+            </w:pPr>
+            <w:r>
+              <w:rPr>
+                <w:sz w:val="20"/>
+              </w:rPr>
+              <w:t>Credibility</w:t>
+            </w:r>
+          </w:p>
+        </w:tc>
+        <w:tc>
+          <w:tcPr>
+            <w:tcW w:type="dxa" w:w="4365"/>
+          </w:tcPr>
+          <w:p>
+            <w:pPr>
+              <w:spacing w:before="0" w:after="0"/>
+            </w:pPr>
+            <w:r>
+              <w:rPr>
+                <w:sz w:val="20"/>
+              </w:rPr>
+              <w:t>The design look was named in 46.1% of the comments on credibility (Fogg et al. 2003).</w:t>
+            </w:r>
+          </w:p>
+        </w:tc>
+        <w:tc>
+          <w:tcPr>
+            <w:tcW w:type="dxa" w:w="3416"/>
+          </w:tcPr>
+          <w:p>
+            <w:pPr>
+              <w:spacing w:before="0" w:after="0"/>
+            </w:pPr>
+            <w:r>
+              <w:rPr>
+                <w:sz w:val="20"/>
+              </w:rPr>
+              <w:t>Count a care detail (spelling, alignment, tone) as a trust measure.</w:t>
+            </w:r>
+          </w:p>
+        </w:tc>
+      </w:tr>
+    </w:tbl>
+    <w:p>
+      <w:pPr>
+        <w:spacing w:before="0" w:after="80"/>
+      </w:pPr>
+    </w:p>
     <w:tbl>
       <w:tblPr>
         <w:tblW w:w="9598" w:type="dxa"/>
@@ -5651,7 +7163,7 @@
             </w:pPr>
             <w:r>
               <w:rPr/>
-              <w:t>Moss &amp; Pine, Hana, Jonas, Wanda and Bruno are made up for this example. Credibility and perceived competence follow Fogg (2003); first impressions within a fraction of a second follow Lindgaard et al. (2006); rating options on the same criteria with a reason follows Gibbons (2018). The four criteria are the ones the plan names for the case study.</w:t>
+              <w:t>Moss &amp; Pine, Hana, Jonas, Wanda and Bruno are made up for this example. Credibility and perceived competence follow Fogg (2003); first impressions within a fraction of a second follow Lindgaard et al. (2006); rating options on the same criteria with a reason follows Gibbons (2018). The four criteria are the ones the plan names for the case study. The findings in the table of real evidence are real research results, rules and cases; the sources are listed below.</w:t>
             </w:r>
           </w:p>
         </w:tc>
@@ -5840,7 +7352,7 @@
           <w:color w:val="556274"/>
           <w:sz w:val="18"/>
         </w:rPr>
-        <w:t>Fogg 2003 · Lindgaard et al. 2006 · Gibbons 2018</w:t>
+        <w:t>Fogg 2003 · Lindgaard et al. 2006 · Gibbons 2018 · Sillence et al. 2004 · Tractinsky et al. 2000 · Fogg et al. 2003</w:t>
       </w:r>
     </w:p>
     <w:p>
@@ -6147,6 +7659,266 @@
         <w:t>Figure 8 · The layers of emotional UX, from a guiding vision to every message.</w:t>
       </w:r>
     </w:p>
+    <w:p>
+      <w:pPr>
+        <w:spacing w:before="0" w:after="100"/>
+      </w:pPr>
+      <w:r>
+        <w:rPr>
+          <w:b/>
+        </w:rPr>
+        <w:t>Emotional UX in the architecture: real structures</w:t>
+      </w:r>
+    </w:p>
+    <w:tbl>
+      <w:tblPr>
+        <w:tblW w:w="9638" w:type="dxa"/>
+        <w:tblBorders>
+          <w:top w:val="single" w:sz="4" w:space="0" w:color="D5DEE9"/>
+          <w:left w:val="single" w:sz="4" w:space="0" w:color="D5DEE9"/>
+          <w:bottom w:val="single" w:sz="4" w:space="0" w:color="D5DEE9"/>
+          <w:right w:val="single" w:sz="4" w:space="0" w:color="D5DEE9"/>
+          <w:insideH w:val="single" w:sz="4" w:space="0" w:color="D5DEE9"/>
+          <w:insideV w:val="single" w:sz="4" w:space="0" w:color="D5DEE9"/>
+        </w:tblBorders>
+        <w:tblLayout w:type="fixed"/>
+        <w:tblCellMar>
+          <w:top w:w="60" w:type="dxa"/>
+          <w:left w:w="100" w:type="dxa"/>
+          <w:bottom w:w="60" w:type="dxa"/>
+          <w:right w:w="100" w:type="dxa"/>
+        </w:tblCellMar>
+      </w:tblPr>
+      <w:tblGrid>
+        <w:gridCol w:w="1969"/>
+        <w:gridCol w:w="4396"/>
+        <w:gridCol w:w="3273"/>
+      </w:tblGrid>
+      <w:tr>
+        <w:trPr>
+          <w:cantSplit/>
+          <w:tblHeader/>
+        </w:trPr>
+        <w:tc>
+          <w:tcPr>
+            <w:tcW w:type="dxa" w:w="1969"/>
+            <w:shd w:val="clear" w:color="auto" w:fill="E6ECF4"/>
+          </w:tcPr>
+          <w:p>
+            <w:pPr>
+              <w:spacing w:before="0" w:after="0"/>
+            </w:pPr>
+            <w:r>
+              <w:rPr>
+                <w:b/>
+                <w:sz w:val="20"/>
+              </w:rPr>
+              <w:t>Part</w:t>
+            </w:r>
+          </w:p>
+        </w:tc>
+        <w:tc>
+          <w:tcPr>
+            <w:tcW w:type="dxa" w:w="4396"/>
+            <w:shd w:val="clear" w:color="auto" w:fill="E6ECF4"/>
+          </w:tcPr>
+          <w:p>
+            <w:pPr>
+              <w:spacing w:before="0" w:after="0"/>
+            </w:pPr>
+            <w:r>
+              <w:rPr>
+                <w:b/>
+                <w:sz w:val="20"/>
+              </w:rPr>
+              <w:t>Real example</w:t>
+            </w:r>
+          </w:p>
+        </w:tc>
+        <w:tc>
+          <w:tcPr>
+            <w:tcW w:type="dxa" w:w="3273"/>
+            <w:shd w:val="clear" w:color="auto" w:fill="E6ECF4"/>
+          </w:tcPr>
+          <w:p>
+            <w:pPr>
+              <w:spacing w:before="0" w:after="0"/>
+            </w:pPr>
+            <w:r>
+              <w:rPr>
+                <w:b/>
+                <w:sz w:val="20"/>
+              </w:rPr>
+              <w:t>What it means</w:t>
+            </w:r>
+          </w:p>
+        </w:tc>
+      </w:tr>
+      <w:tr>
+        <w:trPr>
+          <w:cantSplit/>
+        </w:trPr>
+        <w:tc>
+          <w:tcPr>
+            <w:tcW w:type="dxa" w:w="1969"/>
+          </w:tcPr>
+          <w:p>
+            <w:pPr>
+              <w:spacing w:before="0" w:after="0"/>
+            </w:pPr>
+            <w:r>
+              <w:rPr>
+                <w:sz w:val="20"/>
+              </w:rPr>
+              <w:t>Voice and tone as a system</w:t>
+            </w:r>
+          </w:p>
+        </w:tc>
+        <w:tc>
+          <w:tcPr>
+            <w:tcW w:type="dxa" w:w="4396"/>
+          </w:tcPr>
+          <w:p>
+            <w:pPr>
+              <w:spacing w:before="0" w:after="0"/>
+            </w:pPr>
+            <w:r>
+              <w:rPr>
+                <w:sz w:val="20"/>
+              </w:rPr>
+              <w:t>Mailchimp publishes a voice and tone guide with a steady voice and a tone that follows the situation of the reader (Mailchimp, Voice and Tone).</w:t>
+            </w:r>
+          </w:p>
+        </w:tc>
+        <w:tc>
+          <w:tcPr>
+            <w:tcW w:type="dxa" w:w="3273"/>
+          </w:tcPr>
+          <w:p>
+            <w:pPr>
+              <w:spacing w:before="0" w:after="0"/>
+            </w:pPr>
+            <w:r>
+              <w:rPr>
+                <w:sz w:val="20"/>
+              </w:rPr>
+              <w:t>Treat the tone as a written, shared standard, not as the taste of one writer.</w:t>
+            </w:r>
+          </w:p>
+        </w:tc>
+      </w:tr>
+      <w:tr>
+        <w:trPr>
+          <w:cantSplit/>
+        </w:trPr>
+        <w:tc>
+          <w:tcPr>
+            <w:tcW w:type="dxa" w:w="1969"/>
+          </w:tcPr>
+          <w:p>
+            <w:pPr>
+              <w:spacing w:before="0" w:after="0"/>
+            </w:pPr>
+            <w:r>
+              <w:rPr>
+                <w:sz w:val="20"/>
+              </w:rPr>
+              <w:t>Layers of emotional effect</w:t>
+            </w:r>
+          </w:p>
+        </w:tc>
+        <w:tc>
+          <w:tcPr>
+            <w:tcW w:type="dxa" w:w="4396"/>
+          </w:tcPr>
+          <w:p>
+            <w:pPr>
+              <w:spacing w:before="0" w:after="0"/>
+            </w:pPr>
+            <w:r>
+              <w:rPr>
+                <w:sz w:val="20"/>
+              </w:rPr>
+              <w:t>Norman's three levels and Walter's hierarchy give a structure to plan for: first look, use, meaning (Norman 2004; Walter 2011).</w:t>
+            </w:r>
+          </w:p>
+        </w:tc>
+        <w:tc>
+          <w:tcPr>
+            <w:tcW w:type="dxa" w:w="3273"/>
+          </w:tcPr>
+          <w:p>
+            <w:pPr>
+              <w:spacing w:before="0" w:after="0"/>
+            </w:pPr>
+            <w:r>
+              <w:rPr>
+                <w:sz w:val="20"/>
+              </w:rPr>
+              <w:t>Decide which level each touchpoint must serve.</w:t>
+            </w:r>
+          </w:p>
+        </w:tc>
+      </w:tr>
+      <w:tr>
+        <w:trPr>
+          <w:cantSplit/>
+        </w:trPr>
+        <w:tc>
+          <w:tcPr>
+            <w:tcW w:type="dxa" w:w="1969"/>
+          </w:tcPr>
+          <w:p>
+            <w:pPr>
+              <w:spacing w:before="0" w:after="0"/>
+            </w:pPr>
+            <w:r>
+              <w:rPr>
+                <w:sz w:val="20"/>
+              </w:rPr>
+              <w:t>Part of the definition</w:t>
+            </w:r>
+          </w:p>
+        </w:tc>
+        <w:tc>
+          <w:tcPr>
+            <w:tcW w:type="dxa" w:w="4396"/>
+          </w:tcPr>
+          <w:p>
+            <w:pPr>
+              <w:spacing w:before="0" w:after="0"/>
+            </w:pPr>
+            <w:r>
+              <w:rPr>
+                <w:sz w:val="20"/>
+              </w:rPr>
+              <w:t>ISO 9241-210 includes emotions in the definition of user experience.</w:t>
+            </w:r>
+          </w:p>
+        </w:tc>
+        <w:tc>
+          <w:tcPr>
+            <w:tcW w:type="dxa" w:w="3273"/>
+          </w:tcPr>
+          <w:p>
+            <w:pPr>
+              <w:spacing w:before="0" w:after="0"/>
+            </w:pPr>
+            <w:r>
+              <w:rPr>
+                <w:sz w:val="20"/>
+              </w:rPr>
+              <w:t>A UX strategy that leaves emotion out is not complete by the standard's own definition.</w:t>
+            </w:r>
+          </w:p>
+        </w:tc>
+      </w:tr>
+    </w:tbl>
+    <w:p>
+      <w:pPr>
+        <w:spacing w:before="0" w:after="80"/>
+      </w:pPr>
+    </w:p>
     <w:tbl>
       <w:tblPr>
         <w:tblW w:w="9598" w:type="dxa"/>
@@ -6196,7 +7968,7 @@
             </w:pPr>
             <w:r>
               <w:rPr/>
-              <w:t>Moss &amp; Pine, Hana, Jonas, Wanda and Bruno are made up for this example. Emotion as a property of the product follows Norman (2004) and Hassenzahl (2010); tone and personality as a design system of their own follow Walter (2011).</w:t>
+              <w:t>Moss &amp; Pine, Hana, Jonas, Wanda and Bruno are made up for this example. Emotion as a property of the product follows Norman (2004) and Hassenzahl (2010); tone and personality as a design system of their own follow Walter (2011). The findings in the table of real evidence are real research results, rules and cases; the sources are listed below.</w:t>
             </w:r>
           </w:p>
         </w:tc>
@@ -6385,7 +8157,7 @@
           <w:color w:val="556274"/>
           <w:sz w:val="18"/>
         </w:rPr>
-        <w:t>Norman 2004 · Walter 2011 · Hassenzahl 2010</w:t>
+        <w:t>Norman 2004 · Walter 2011 · Hassenzahl 2010 · Mailchimp, Voice and Tone · ISO 9241-210</w:t>
       </w:r>
     </w:p>
     <w:p>
@@ -6825,6 +8597,266 @@
         <w:spacing w:before="0" w:after="80"/>
       </w:pPr>
     </w:p>
+    <w:p>
+      <w:pPr>
+        <w:spacing w:before="0" w:after="100"/>
+      </w:pPr>
+      <w:r>
+        <w:rPr>
+          <w:b/>
+        </w:rPr>
+        <w:t>Conflicts of emotional UX, with evidence</w:t>
+      </w:r>
+    </w:p>
+    <w:tbl>
+      <w:tblPr>
+        <w:tblW w:w="9638" w:type="dxa"/>
+        <w:tblBorders>
+          <w:top w:val="single" w:sz="4" w:space="0" w:color="D5DEE9"/>
+          <w:left w:val="single" w:sz="4" w:space="0" w:color="D5DEE9"/>
+          <w:bottom w:val="single" w:sz="4" w:space="0" w:color="D5DEE9"/>
+          <w:right w:val="single" w:sz="4" w:space="0" w:color="D5DEE9"/>
+          <w:insideH w:val="single" w:sz="4" w:space="0" w:color="D5DEE9"/>
+          <w:insideV w:val="single" w:sz="4" w:space="0" w:color="D5DEE9"/>
+        </w:tblBorders>
+        <w:tblLayout w:type="fixed"/>
+        <w:tblCellMar>
+          <w:top w:w="60" w:type="dxa"/>
+          <w:left w:w="100" w:type="dxa"/>
+          <w:bottom w:w="60" w:type="dxa"/>
+          <w:right w:w="100" w:type="dxa"/>
+        </w:tblCellMar>
+      </w:tblPr>
+      <w:tblGrid>
+        <w:gridCol w:w="2120"/>
+        <w:gridCol w:w="4327"/>
+        <w:gridCol w:w="3191"/>
+      </w:tblGrid>
+      <w:tr>
+        <w:trPr>
+          <w:cantSplit/>
+          <w:tblHeader/>
+        </w:trPr>
+        <w:tc>
+          <w:tcPr>
+            <w:tcW w:type="dxa" w:w="2120"/>
+            <w:shd w:val="clear" w:color="auto" w:fill="E6ECF4"/>
+          </w:tcPr>
+          <w:p>
+            <w:pPr>
+              <w:spacing w:before="0" w:after="0"/>
+            </w:pPr>
+            <w:r>
+              <w:rPr>
+                <w:b/>
+                <w:sz w:val="20"/>
+              </w:rPr>
+              <w:t>Conflict</w:t>
+            </w:r>
+          </w:p>
+        </w:tc>
+        <w:tc>
+          <w:tcPr>
+            <w:tcW w:type="dxa" w:w="4327"/>
+            <w:shd w:val="clear" w:color="auto" w:fill="E6ECF4"/>
+          </w:tcPr>
+          <w:p>
+            <w:pPr>
+              <w:spacing w:before="0" w:after="0"/>
+            </w:pPr>
+            <w:r>
+              <w:rPr>
+                <w:b/>
+                <w:sz w:val="20"/>
+              </w:rPr>
+              <w:t>What the evidence says</w:t>
+            </w:r>
+          </w:p>
+        </w:tc>
+        <w:tc>
+          <w:tcPr>
+            <w:tcW w:type="dxa" w:w="3191"/>
+            <w:shd w:val="clear" w:color="auto" w:fill="E6ECF4"/>
+          </w:tcPr>
+          <w:p>
+            <w:pPr>
+              <w:spacing w:before="0" w:after="0"/>
+            </w:pPr>
+            <w:r>
+              <w:rPr>
+                <w:b/>
+                <w:sz w:val="20"/>
+              </w:rPr>
+              <w:t>A way to decide</w:t>
+            </w:r>
+          </w:p>
+        </w:tc>
+      </w:tr>
+      <w:tr>
+        <w:trPr>
+          <w:cantSplit/>
+        </w:trPr>
+        <w:tc>
+          <w:tcPr>
+            <w:tcW w:type="dxa" w:w="2120"/>
+          </w:tcPr>
+          <w:p>
+            <w:pPr>
+              <w:spacing w:before="0" w:after="0"/>
+            </w:pPr>
+            <w:r>
+              <w:rPr>
+                <w:sz w:val="20"/>
+              </w:rPr>
+              <w:t>Seriousness against closeness</w:t>
+            </w:r>
+          </w:p>
+        </w:tc>
+        <w:tc>
+          <w:tcPr>
+            <w:tcW w:type="dxa" w:w="4327"/>
+          </w:tcPr>
+          <w:p>
+            <w:pPr>
+              <w:spacing w:before="0" w:after="0"/>
+            </w:pPr>
+            <w:r>
+              <w:rPr>
+                <w:sz w:val="20"/>
+              </w:rPr>
+              <w:t>Tone can change with the situation while the voice stays the same (Mailchimp, Voice and Tone).</w:t>
+            </w:r>
+          </w:p>
+        </w:tc>
+        <w:tc>
+          <w:tcPr>
+            <w:tcW w:type="dxa" w:w="3191"/>
+          </w:tcPr>
+          <w:p>
+            <w:pPr>
+              <w:spacing w:before="0" w:after="0"/>
+            </w:pPr>
+            <w:r>
+              <w:rPr>
+                <w:sz w:val="20"/>
+              </w:rPr>
+              <w:t>Keep the voice of the brand and set the tone by the situation: warm for a welcome, plain for an error.</w:t>
+            </w:r>
+          </w:p>
+        </w:tc>
+      </w:tr>
+      <w:tr>
+        <w:trPr>
+          <w:cantSplit/>
+        </w:trPr>
+        <w:tc>
+          <w:tcPr>
+            <w:tcW w:type="dxa" w:w="2120"/>
+          </w:tcPr>
+          <w:p>
+            <w:pPr>
+              <w:spacing w:before="0" w:after="0"/>
+            </w:pPr>
+            <w:r>
+              <w:rPr>
+                <w:sz w:val="20"/>
+              </w:rPr>
+              <w:t>Activation against credibility</w:t>
+            </w:r>
+          </w:p>
+        </w:tc>
+        <w:tc>
+          <w:tcPr>
+            <w:tcW w:type="dxa" w:w="4327"/>
+          </w:tcPr>
+          <w:p>
+            <w:pPr>
+              <w:spacing w:before="0" w:after="0"/>
+            </w:pPr>
+            <w:r>
+              <w:rPr>
+                <w:sz w:val="20"/>
+              </w:rPr>
+              <w:t>Pressure patterns were found on about 11% of the crawled shopping websites (Mathur et al. 2019), and exaggeration lowers credibility (Fogg 2003).</w:t>
+            </w:r>
+          </w:p>
+        </w:tc>
+        <w:tc>
+          <w:tcPr>
+            <w:tcW w:type="dxa" w:w="3191"/>
+          </w:tcPr>
+          <w:p>
+            <w:pPr>
+              <w:spacing w:before="0" w:after="0"/>
+            </w:pPr>
+            <w:r>
+              <w:rPr>
+                <w:sz w:val="20"/>
+              </w:rPr>
+              <w:t>Apply the test: would the message still work if people knew why it was written?</w:t>
+            </w:r>
+          </w:p>
+        </w:tc>
+      </w:tr>
+      <w:tr>
+        <w:trPr>
+          <w:cantSplit/>
+        </w:trPr>
+        <w:tc>
+          <w:tcPr>
+            <w:tcW w:type="dxa" w:w="2120"/>
+          </w:tcPr>
+          <w:p>
+            <w:pPr>
+              <w:spacing w:before="0" w:after="0"/>
+            </w:pPr>
+            <w:r>
+              <w:rPr>
+                <w:sz w:val="20"/>
+              </w:rPr>
+              <w:t>Brand effect against user effect</w:t>
+            </w:r>
+          </w:p>
+        </w:tc>
+        <w:tc>
+          <w:tcPr>
+            <w:tcW w:type="dxa" w:w="4327"/>
+          </w:tcPr>
+          <w:p>
+            <w:pPr>
+              <w:spacing w:before="0" w:after="0"/>
+            </w:pPr>
+            <w:r>
+              <w:rPr>
+                <w:sz w:val="20"/>
+              </w:rPr>
+              <w:t>The design look drives judgements of credibility (Fogg et al. 2003), and design appeal decides rejection (Sillence et al. 2004).</w:t>
+            </w:r>
+          </w:p>
+        </w:tc>
+        <w:tc>
+          <w:tcPr>
+            <w:tcW w:type="dxa" w:w="3191"/>
+          </w:tcPr>
+          <w:p>
+            <w:pPr>
+              <w:spacing w:before="0" w:after="0"/>
+            </w:pPr>
+            <w:r>
+              <w:rPr>
+                <w:sz w:val="20"/>
+              </w:rPr>
+              <w:t>Judge a campaign by what the person needs now, then by the brand.</w:t>
+            </w:r>
+          </w:p>
+        </w:tc>
+      </w:tr>
+    </w:tbl>
+    <w:p>
+      <w:pPr>
+        <w:spacing w:before="0" w:after="80"/>
+      </w:pPr>
+    </w:p>
     <w:tbl>
       <w:tblPr>
         <w:tblW w:w="9598" w:type="dxa"/>
@@ -6874,7 +8906,7 @@
             </w:pPr>
             <w:r>
               <w:rPr/>
-              <w:t>Moss &amp; Pine, Hana, Jonas, Wanda and Bruno are made up for this example. The four situations are a reading of the example, not a rule for every product.</w:t>
+              <w:t>Moss &amp; Pine, Hana, Jonas, Wanda and Bruno are made up for this example. The four situations are a reading of the example, not a rule for every product. The findings in the table of real evidence are real research results, rules and cases; the sources are listed below.</w:t>
             </w:r>
           </w:p>
         </w:tc>
@@ -7063,7 +9095,7 @@
           <w:color w:val="556274"/>
           <w:sz w:val="18"/>
         </w:rPr>
-        <w:t>Mathur et al. 2019 · Fogg 2003 · Gibbons 2018</w:t>
+        <w:t>Mathur et al. 2019 · Fogg 2003 · Gibbons 2018 · Mailchimp, Voice and Tone · Fogg et al. 2003 · Sillence et al. 2004</w:t>
       </w:r>
     </w:p>
     <w:p>
@@ -7503,6 +9535,266 @@
         <w:spacing w:before="0" w:after="80"/>
       </w:pPr>
     </w:p>
+    <w:p>
+      <w:pPr>
+        <w:spacing w:before="0" w:after="100"/>
+      </w:pPr>
+      <w:r>
+        <w:rPr>
+          <w:b/>
+        </w:rPr>
+        <w:t>Owning emotional UX: real rules and a real case</w:t>
+      </w:r>
+    </w:p>
+    <w:tbl>
+      <w:tblPr>
+        <w:tblW w:w="9638" w:type="dxa"/>
+        <w:tblBorders>
+          <w:top w:val="single" w:sz="4" w:space="0" w:color="D5DEE9"/>
+          <w:left w:val="single" w:sz="4" w:space="0" w:color="D5DEE9"/>
+          <w:bottom w:val="single" w:sz="4" w:space="0" w:color="D5DEE9"/>
+          <w:right w:val="single" w:sz="4" w:space="0" w:color="D5DEE9"/>
+          <w:insideH w:val="single" w:sz="4" w:space="0" w:color="D5DEE9"/>
+          <w:insideV w:val="single" w:sz="4" w:space="0" w:color="D5DEE9"/>
+        </w:tblBorders>
+        <w:tblLayout w:type="fixed"/>
+        <w:tblCellMar>
+          <w:top w:w="60" w:type="dxa"/>
+          <w:left w:w="100" w:type="dxa"/>
+          <w:bottom w:w="60" w:type="dxa"/>
+          <w:right w:w="100" w:type="dxa"/>
+        </w:tblCellMar>
+      </w:tblPr>
+      <w:tblGrid>
+        <w:gridCol w:w="1359"/>
+        <w:gridCol w:w="5232"/>
+        <w:gridCol w:w="3047"/>
+      </w:tblGrid>
+      <w:tr>
+        <w:trPr>
+          <w:cantSplit/>
+          <w:tblHeader/>
+        </w:trPr>
+        <w:tc>
+          <w:tcPr>
+            <w:tcW w:type="dxa" w:w="1359"/>
+            <w:shd w:val="clear" w:color="auto" w:fill="E6ECF4"/>
+          </w:tcPr>
+          <w:p>
+            <w:pPr>
+              <w:spacing w:before="0" w:after="0"/>
+            </w:pPr>
+            <w:r>
+              <w:rPr>
+                <w:b/>
+                <w:sz w:val="20"/>
+              </w:rPr>
+              <w:t>Part</w:t>
+            </w:r>
+          </w:p>
+        </w:tc>
+        <w:tc>
+          <w:tcPr>
+            <w:tcW w:type="dxa" w:w="5232"/>
+            <w:shd w:val="clear" w:color="auto" w:fill="E6ECF4"/>
+          </w:tcPr>
+          <w:p>
+            <w:pPr>
+              <w:spacing w:before="0" w:after="0"/>
+            </w:pPr>
+            <w:r>
+              <w:rPr>
+                <w:b/>
+                <w:sz w:val="20"/>
+              </w:rPr>
+              <w:t>Real example or rule</w:t>
+            </w:r>
+          </w:p>
+        </w:tc>
+        <w:tc>
+          <w:tcPr>
+            <w:tcW w:type="dxa" w:w="3047"/>
+            <w:shd w:val="clear" w:color="auto" w:fill="E6ECF4"/>
+          </w:tcPr>
+          <w:p>
+            <w:pPr>
+              <w:spacing w:before="0" w:after="0"/>
+            </w:pPr>
+            <w:r>
+              <w:rPr>
+                <w:b/>
+                <w:sz w:val="20"/>
+              </w:rPr>
+              <w:t>What it means</w:t>
+            </w:r>
+          </w:p>
+        </w:tc>
+      </w:tr>
+      <w:tr>
+        <w:trPr>
+          <w:cantSplit/>
+        </w:trPr>
+        <w:tc>
+          <w:tcPr>
+            <w:tcW w:type="dxa" w:w="1359"/>
+          </w:tcPr>
+          <w:p>
+            <w:pPr>
+              <w:spacing w:before="0" w:after="0"/>
+            </w:pPr>
+            <w:r>
+              <w:rPr>
+                <w:sz w:val="20"/>
+              </w:rPr>
+              <w:t>Who owns the tone</w:t>
+            </w:r>
+          </w:p>
+        </w:tc>
+        <w:tc>
+          <w:tcPr>
+            <w:tcW w:type="dxa" w:w="5232"/>
+          </w:tcPr>
+          <w:p>
+            <w:pPr>
+              <w:spacing w:before="0" w:after="0"/>
+            </w:pPr>
+            <w:r>
+              <w:rPr>
+                <w:sz w:val="20"/>
+              </w:rPr>
+              <w:t>Mailchimp's voice and tone guide is a public document that its writers share (Mailchimp, Voice and Tone).</w:t>
+            </w:r>
+          </w:p>
+        </w:tc>
+        <w:tc>
+          <w:tcPr>
+            <w:tcW w:type="dxa" w:w="3047"/>
+          </w:tcPr>
+          <w:p>
+            <w:pPr>
+              <w:spacing w:before="0" w:after="0"/>
+            </w:pPr>
+            <w:r>
+              <w:rPr>
+                <w:sz w:val="20"/>
+              </w:rPr>
+              <w:t>Name an owner and publish the guide.</w:t>
+            </w:r>
+          </w:p>
+        </w:tc>
+      </w:tr>
+      <w:tr>
+        <w:trPr>
+          <w:cantSplit/>
+        </w:trPr>
+        <w:tc>
+          <w:tcPr>
+            <w:tcW w:type="dxa" w:w="1359"/>
+          </w:tcPr>
+          <w:p>
+            <w:pPr>
+              <w:spacing w:before="0" w:after="0"/>
+            </w:pPr>
+            <w:r>
+              <w:rPr>
+                <w:sz w:val="20"/>
+              </w:rPr>
+              <w:t>Who checks</w:t>
+            </w:r>
+          </w:p>
+        </w:tc>
+        <w:tc>
+          <w:tcPr>
+            <w:tcW w:type="dxa" w:w="5232"/>
+          </w:tcPr>
+          <w:p>
+            <w:pPr>
+              <w:spacing w:before="0" w:after="0"/>
+            </w:pPr>
+            <w:r>
+              <w:rPr>
+                <w:sz w:val="20"/>
+              </w:rPr>
+              <w:t>Manipulative patterns can be bought as a ready-made feature (Mathur et al. 2019), so someone has to check what is installed.</w:t>
+            </w:r>
+          </w:p>
+        </w:tc>
+        <w:tc>
+          <w:tcPr>
+            <w:tcW w:type="dxa" w:w="3047"/>
+          </w:tcPr>
+          <w:p>
+            <w:pPr>
+              <w:spacing w:before="0" w:after="0"/>
+            </w:pPr>
+            <w:r>
+              <w:rPr>
+                <w:sz w:val="20"/>
+              </w:rPr>
+              <w:t>Review third-party components for pressure and guilt.</w:t>
+            </w:r>
+          </w:p>
+        </w:tc>
+      </w:tr>
+      <w:tr>
+        <w:trPr>
+          <w:cantSplit/>
+        </w:trPr>
+        <w:tc>
+          <w:tcPr>
+            <w:tcW w:type="dxa" w:w="1359"/>
+          </w:tcPr>
+          <w:p>
+            <w:pPr>
+              <w:spacing w:before="0" w:after="0"/>
+            </w:pPr>
+            <w:r>
+              <w:rPr>
+                <w:sz w:val="20"/>
+              </w:rPr>
+              <w:t>The legal check</w:t>
+            </w:r>
+          </w:p>
+        </w:tc>
+        <w:tc>
+          <w:tcPr>
+            <w:tcW w:type="dxa" w:w="5232"/>
+          </w:tcPr>
+          <w:p>
+            <w:pPr>
+              <w:spacing w:before="0" w:after="0"/>
+            </w:pPr>
+            <w:r>
+              <w:rPr>
+                <w:sz w:val="20"/>
+              </w:rPr>
+              <w:t>Article 25 of the EU Digital Services Act forbids manipulative interface design on online platforms.</w:t>
+            </w:r>
+          </w:p>
+        </w:tc>
+        <w:tc>
+          <w:tcPr>
+            <w:tcW w:type="dxa" w:w="3047"/>
+          </w:tcPr>
+          <w:p>
+            <w:pPr>
+              <w:spacing w:before="0" w:after="0"/>
+            </w:pPr>
+            <w:r>
+              <w:rPr>
+                <w:sz w:val="20"/>
+              </w:rPr>
+              <w:t>Add a legal check to the release of emotional features.</w:t>
+            </w:r>
+          </w:p>
+        </w:tc>
+      </w:tr>
+    </w:tbl>
+    <w:p>
+      <w:pPr>
+        <w:spacing w:before="0" w:after="80"/>
+      </w:pPr>
+    </w:p>
     <w:tbl>
       <w:tblPr>
         <w:tblW w:w="9598" w:type="dxa"/>
@@ -7552,7 +9844,7 @@
             </w:pPr>
             <w:r>
               <w:rPr/>
-              <w:t>Moss &amp; Pine, Hana, Jonas, Wanda and Bruno are made up for this example. Deciding with limited information follows Simon (1956); the premortem follows Klein (2007).</w:t>
+              <w:t>Moss &amp; Pine, Hana, Jonas, Wanda and Bruno are made up for this example. Deciding with limited information follows Simon (1956); the premortem follows Klein (2007). The findings in the table of real evidence are real research results, rules and cases; the sources are listed below.</w:t>
             </w:r>
           </w:p>
         </w:tc>
@@ -7741,7 +10033,7 @@
           <w:color w:val="556274"/>
           <w:sz w:val="18"/>
         </w:rPr>
-        <w:t>Simon 1956 · Klein 2007 · Walter 2011</w:t>
+        <w:t>Simon 1956 · Klein 2007 · Walter 2011 · Mailchimp, Voice and Tone · Mathur et al. 2019 · EU Digital Services Act</w:t>
       </w:r>
     </w:p>
     <w:p>
@@ -8426,6 +10718,18 @@
         <w:rPr>
           <w:sz w:val="19"/>
         </w:rPr>
+        <w:t>Fogg, B. J., Soohoo, C., Danielson, D. R., Marable, L., Stanford, J., &amp; Tauber, E. R. (2003). How do users evaluate the credibility of Web sites? A study with over 2,500 participants. Proceedings of DUX '03. (2,684 people judged the credibility of 100 live sites; the design look was the factor mentioned most often, in 46.1% of their comments.)</w:t>
+      </w:r>
+    </w:p>
+    <w:p>
+      <w:pPr>
+        <w:spacing w:before="0" w:after="80"/>
+        <w:ind w:left="283" w:hanging="283"/>
+      </w:pPr>
+      <w:r>
+        <w:rPr>
+          <w:sz w:val="19"/>
+        </w:rPr>
         <w:t>Hassenzahl, M. (2010). Experience Design: Technology for All the Right Reasons. Morgan &amp; Claypool. (Experience is more than usability: products meet psychological needs such as competence, relatedness and stimulation.)</w:t>
       </w:r>
     </w:p>
@@ -8486,6 +10790,18 @@
         <w:rPr>
           <w:sz w:val="19"/>
         </w:rPr>
+        <w:t>Mailchimp. Content Style Guide: Voice and Tone. https://styleguide.mailchimp.com/voice-and-tone/ (The voice stays steady and the tone changes with the situation and the feeling of the reader; the guide is published under a Creative Commons licence.)</w:t>
+      </w:r>
+    </w:p>
+    <w:p>
+      <w:pPr>
+        <w:spacing w:before="0" w:after="80"/>
+        <w:ind w:left="283" w:hanging="283"/>
+      </w:pPr>
+      <w:r>
+        <w:rPr>
+          <w:sz w:val="19"/>
+        </w:rPr>
         <w:t>Mathur, A., Acar, G., Friedman, M. J., Lucherini, E., Mayer, J., Chetty, M., &amp; Narayanan, A. (2019). Dark patterns at scale: Findings from a crawl of 11K shopping websites. Proceedings of the ACM on Human-Computer Interaction, 3(CSCW), 1–32. (False urgency, scarcity and confirmshaming are widespread ways of using emotion against users.)</w:t>
       </w:r>
     </w:p>
@@ -8510,6 +10826,30 @@
         <w:rPr>
           <w:sz w:val="19"/>
         </w:rPr>
+        <w:t>Regulation (EU) 2022/2065 of the European Parliament and of the Council (Digital Services Act), Article 25. https://eur-lex.europa.eu/eli/reg/2022/2065/oj (Online platforms must not design their interfaces in a way that deceives or manipulates users or impairs their ability to make free and informed decisions.)</w:t>
+      </w:r>
+    </w:p>
+    <w:p>
+      <w:pPr>
+        <w:spacing w:before="0" w:after="80"/>
+        <w:ind w:left="283" w:hanging="283"/>
+      </w:pPr>
+      <w:r>
+        <w:rPr>
+          <w:sz w:val="19"/>
+        </w:rPr>
+        <w:t>Court of Justice of the European Union (2019). Judgment of 1 October 2019, Planet49, C-673/17. (A pre-ticked checkbox is not valid consent: consent needs an active choice by the user.)</w:t>
+      </w:r>
+    </w:p>
+    <w:p>
+      <w:pPr>
+        <w:spacing w:before="0" w:after="80"/>
+        <w:ind w:left="283" w:hanging="283"/>
+      </w:pPr>
+      <w:r>
+        <w:rPr>
+          <w:sz w:val="19"/>
+        </w:rPr>
         <w:t>Lindgaard, G., Fernandes, G., Dudek, C., &amp; Brown, J. (2006). Attention web designers: You have 50 milliseconds to make a good first impression! Behaviour &amp; Information Technology, 25(2), 115–126. (A first judgement of a web page forms within a fraction of a second and stays close to the judgement people give later.)</w:t>
       </w:r>
     </w:p>
@@ -8523,6 +10863,30 @@
           <w:sz w:val="19"/>
         </w:rPr>
         <w:t>Gibbons, S. (2018). Using Prioritization Matrices to Inform UX Decisions. Nielsen Norman Group. https://www.nngroup.com/articles/prioritization-matrices/ (Rate each option on the same few criteria, such as value to the user against effort, and put the reason next to each rating.)</w:t>
+      </w:r>
+    </w:p>
+    <w:p>
+      <w:pPr>
+        <w:spacing w:before="0" w:after="80"/>
+        <w:ind w:left="283" w:hanging="283"/>
+      </w:pPr>
+      <w:r>
+        <w:rPr>
+          <w:sz w:val="19"/>
+        </w:rPr>
+        <w:t>Sillence, E., Briggs, P., Fishwick, L., &amp; Harris, P. (2004). Trust and mistrust of online health sites. Proceedings of CHI 2004, 663–670. (Fifteen women searched for health advice over four weeks: design appeal predicted the rejection of a site, credibility of the information and personalisation predicted its selection.)</w:t>
+      </w:r>
+    </w:p>
+    <w:p>
+      <w:pPr>
+        <w:spacing w:before="0" w:after="80"/>
+        <w:ind w:left="283" w:hanging="283"/>
+      </w:pPr>
+      <w:r>
+        <w:rPr>
+          <w:sz w:val="19"/>
+        </w:rPr>
+        <w:t>Tractinsky, N., Katz, A. S., &amp; Ikar, D. (2000). What is beautiful is usable. Interacting with Computers, 13(2), 127–145. (People judge an attractive interface as easier to use before they have used it; looks shape the first judgement, they do not replace testing.)</w:t>
       </w:r>
     </w:p>
     <w:p>
@@ -8595,10 +10959,10 @@
         </w:tblCellMar>
       </w:tblPr>
       <w:tblGrid>
-        <w:gridCol w:w="2770"/>
-        <w:gridCol w:w="4611"/>
-        <w:gridCol w:w="1369"/>
-        <w:gridCol w:w="888"/>
+        <w:gridCol w:w="2767"/>
+        <w:gridCol w:w="4630"/>
+        <w:gridCol w:w="1355"/>
+        <w:gridCol w:w="886"/>
       </w:tblGrid>
       <w:tr>
         <w:trPr>
@@ -8607,7 +10971,7 @@
         </w:trPr>
         <w:tc>
           <w:tcPr>
-            <w:tcW w:type="dxa" w:w="2770"/>
+            <w:tcW w:type="dxa" w:w="2767"/>
             <w:shd w:val="clear" w:color="auto" w:fill="E6ECF4"/>
           </w:tcPr>
           <w:p>
@@ -8625,7 +10989,7 @@
         </w:tc>
         <w:tc>
           <w:tcPr>
-            <w:tcW w:type="dxa" w:w="4611"/>
+            <w:tcW w:type="dxa" w:w="4630"/>
             <w:shd w:val="clear" w:color="auto" w:fill="E6ECF4"/>
           </w:tcPr>
           <w:p>
@@ -8643,7 +11007,7 @@
         </w:tc>
         <w:tc>
           <w:tcPr>
-            <w:tcW w:type="dxa" w:w="1369"/>
+            <w:tcW w:type="dxa" w:w="1355"/>
             <w:shd w:val="clear" w:color="auto" w:fill="E6ECF4"/>
           </w:tcPr>
           <w:p>
@@ -8661,7 +11025,7 @@
         </w:tc>
         <w:tc>
           <w:tcPr>
-            <w:tcW w:type="dxa" w:w="888"/>
+            <w:tcW w:type="dxa" w:w="886"/>
             <w:shd w:val="clear" w:color="auto" w:fill="E6ECF4"/>
           </w:tcPr>
           <w:p>
@@ -8684,7 +11048,7 @@
         </w:trPr>
         <w:tc>
           <w:tcPr>
-            <w:tcW w:type="dxa" w:w="2770"/>
+            <w:tcW w:type="dxa" w:w="2767"/>
           </w:tcPr>
           <w:p>
             <w:pPr>
@@ -8701,7 +11065,7 @@
         </w:tc>
         <w:tc>
           <w:tcPr>
-            <w:tcW w:type="dxa" w:w="4611"/>
+            <w:tcW w:type="dxa" w:w="4630"/>
           </w:tcPr>
           <w:p>
             <w:pPr>
@@ -8717,7 +11081,7 @@
         </w:tc>
         <w:tc>
           <w:tcPr>
-            <w:tcW w:type="dxa" w:w="1369"/>
+            <w:tcW w:type="dxa" w:w="1355"/>
           </w:tcPr>
           <w:p>
             <w:pPr>
@@ -8733,7 +11097,7 @@
         </w:tc>
         <w:tc>
           <w:tcPr>
-            <w:tcW w:type="dxa" w:w="888"/>
+            <w:tcW w:type="dxa" w:w="886"/>
           </w:tcPr>
           <w:p>
             <w:pPr>
@@ -8754,7 +11118,7 @@
         </w:trPr>
         <w:tc>
           <w:tcPr>
-            <w:tcW w:type="dxa" w:w="2770"/>
+            <w:tcW w:type="dxa" w:w="2767"/>
           </w:tcPr>
           <w:p>
             <w:pPr>
@@ -8771,7 +11135,7 @@
         </w:tc>
         <w:tc>
           <w:tcPr>
-            <w:tcW w:type="dxa" w:w="4611"/>
+            <w:tcW w:type="dxa" w:w="4630"/>
           </w:tcPr>
           <w:p>
             <w:pPr>
@@ -8787,7 +11151,7 @@
         </w:tc>
         <w:tc>
           <w:tcPr>
-            <w:tcW w:type="dxa" w:w="1369"/>
+            <w:tcW w:type="dxa" w:w="1355"/>
           </w:tcPr>
           <w:p>
             <w:pPr>
@@ -8803,7 +11167,7 @@
         </w:tc>
         <w:tc>
           <w:tcPr>
-            <w:tcW w:type="dxa" w:w="888"/>
+            <w:tcW w:type="dxa" w:w="886"/>
           </w:tcPr>
           <w:p>
             <w:pPr>
@@ -8824,7 +11188,7 @@
         </w:trPr>
         <w:tc>
           <w:tcPr>
-            <w:tcW w:type="dxa" w:w="2770"/>
+            <w:tcW w:type="dxa" w:w="2767"/>
           </w:tcPr>
           <w:p>
             <w:pPr>
@@ -8841,7 +11205,7 @@
         </w:tc>
         <w:tc>
           <w:tcPr>
-            <w:tcW w:type="dxa" w:w="4611"/>
+            <w:tcW w:type="dxa" w:w="4630"/>
           </w:tcPr>
           <w:p>
             <w:pPr>
@@ -8857,7 +11221,7 @@
         </w:tc>
         <w:tc>
           <w:tcPr>
-            <w:tcW w:type="dxa" w:w="1369"/>
+            <w:tcW w:type="dxa" w:w="1355"/>
           </w:tcPr>
           <w:p>
             <w:pPr>
@@ -8873,7 +11237,7 @@
         </w:tc>
         <w:tc>
           <w:tcPr>
-            <w:tcW w:type="dxa" w:w="888"/>
+            <w:tcW w:type="dxa" w:w="886"/>
           </w:tcPr>
           <w:p>
             <w:pPr>
@@ -8894,7 +11258,7 @@
         </w:trPr>
         <w:tc>
           <w:tcPr>
-            <w:tcW w:type="dxa" w:w="2770"/>
+            <w:tcW w:type="dxa" w:w="2767"/>
           </w:tcPr>
           <w:p>
             <w:pPr>
@@ -8911,7 +11275,7 @@
         </w:tc>
         <w:tc>
           <w:tcPr>
-            <w:tcW w:type="dxa" w:w="4611"/>
+            <w:tcW w:type="dxa" w:w="4630"/>
           </w:tcPr>
           <w:p>
             <w:pPr>
@@ -8927,7 +11291,7 @@
         </w:tc>
         <w:tc>
           <w:tcPr>
-            <w:tcW w:type="dxa" w:w="1369"/>
+            <w:tcW w:type="dxa" w:w="1355"/>
           </w:tcPr>
           <w:p>
             <w:pPr>
@@ -8943,7 +11307,7 @@
         </w:tc>
         <w:tc>
           <w:tcPr>
-            <w:tcW w:type="dxa" w:w="888"/>
+            <w:tcW w:type="dxa" w:w="886"/>
           </w:tcPr>
           <w:p>
             <w:pPr>
@@ -8964,7 +11328,7 @@
         </w:trPr>
         <w:tc>
           <w:tcPr>
-            <w:tcW w:type="dxa" w:w="2770"/>
+            <w:tcW w:type="dxa" w:w="2767"/>
           </w:tcPr>
           <w:p>
             <w:pPr>
@@ -8981,7 +11345,7 @@
         </w:tc>
         <w:tc>
           <w:tcPr>
-            <w:tcW w:type="dxa" w:w="4611"/>
+            <w:tcW w:type="dxa" w:w="4630"/>
           </w:tcPr>
           <w:p>
             <w:pPr>
@@ -8997,7 +11361,7 @@
         </w:tc>
         <w:tc>
           <w:tcPr>
-            <w:tcW w:type="dxa" w:w="1369"/>
+            <w:tcW w:type="dxa" w:w="1355"/>
           </w:tcPr>
           <w:p>
             <w:pPr>
@@ -9013,7 +11377,7 @@
         </w:tc>
         <w:tc>
           <w:tcPr>
-            <w:tcW w:type="dxa" w:w="888"/>
+            <w:tcW w:type="dxa" w:w="886"/>
           </w:tcPr>
           <w:p>
             <w:pPr>
@@ -9034,7 +11398,7 @@
         </w:trPr>
         <w:tc>
           <w:tcPr>
-            <w:tcW w:type="dxa" w:w="2770"/>
+            <w:tcW w:type="dxa" w:w="2767"/>
           </w:tcPr>
           <w:p>
             <w:pPr>
@@ -9045,13 +11409,13 @@
                 <w:b/>
                 <w:sz w:val="19"/>
               </w:rPr>
-              <w:t>Dark pattern</w:t>
-            </w:r>
-          </w:p>
-        </w:tc>
-        <w:tc>
-          <w:tcPr>
-            <w:tcW w:type="dxa" w:w="4611"/>
+              <w:t>Component</w:t>
+            </w:r>
+          </w:p>
+        </w:tc>
+        <w:tc>
+          <w:tcPr>
+            <w:tcW w:type="dxa" w:w="4630"/>
           </w:tcPr>
           <w:p>
             <w:pPr>
@@ -9061,13 +11425,13 @@
               <w:rPr>
                 <w:sz w:val="19"/>
               </w:rPr>
-              <w:t>A design that uses emotion against people's own interest, such as false urgency, guilt or hidden costs.</w:t>
-            </w:r>
-          </w:p>
-        </w:tc>
-        <w:tc>
-          <w:tcPr>
-            <w:tcW w:type="dxa" w:w="1369"/>
+              <w:t>A reusable building block of an interface, such as a button, a form field or a status label, built once and used on many screens.</w:t>
+            </w:r>
+          </w:p>
+        </w:tc>
+        <w:tc>
+          <w:tcPr>
+            <w:tcW w:type="dxa" w:w="1355"/>
           </w:tcPr>
           <w:p>
             <w:pPr>
@@ -9083,7 +11447,7 @@
         </w:tc>
         <w:tc>
           <w:tcPr>
-            <w:tcW w:type="dxa" w:w="888"/>
+            <w:tcW w:type="dxa" w:w="886"/>
           </w:tcPr>
           <w:p>
             <w:pPr>
@@ -9093,7 +11457,7 @@
               <w:rPr>
                 <w:sz w:val="19"/>
               </w:rPr>
-              <w:t>Day 7</w:t>
+              <w:t>Day 6</w:t>
             </w:r>
           </w:p>
         </w:tc>
@@ -9104,7 +11468,7 @@
         </w:trPr>
         <w:tc>
           <w:tcPr>
-            <w:tcW w:type="dxa" w:w="2770"/>
+            <w:tcW w:type="dxa" w:w="2767"/>
           </w:tcPr>
           <w:p>
             <w:pPr>
@@ -9115,13 +11479,13 @@
                 <w:b/>
                 <w:sz w:val="19"/>
               </w:rPr>
-              <w:t>Design logic</w:t>
-            </w:r>
-          </w:p>
-        </w:tc>
-        <w:tc>
-          <w:tcPr>
-            <w:tcW w:type="dxa" w:w="4611"/>
+              <w:t>Dark pattern</w:t>
+            </w:r>
+          </w:p>
+        </w:tc>
+        <w:tc>
+          <w:tcPr>
+            <w:tcW w:type="dxa" w:w="4630"/>
           </w:tcPr>
           <w:p>
             <w:pPr>
@@ -9131,13 +11495,13 @@
               <w:rPr>
                 <w:sz w:val="19"/>
               </w:rPr>
-              <w:t>A set of decided rules and shared components, such as which colour means what and which type levels exist, used for every screen so everything stays consistent.</w:t>
-            </w:r>
-          </w:p>
-        </w:tc>
-        <w:tc>
-          <w:tcPr>
-            <w:tcW w:type="dxa" w:w="1369"/>
+              <w:t>A design that uses emotion against people's own interest, such as false urgency, guilt or hidden costs.</w:t>
+            </w:r>
+          </w:p>
+        </w:tc>
+        <w:tc>
+          <w:tcPr>
+            <w:tcW w:type="dxa" w:w="1355"/>
           </w:tcPr>
           <w:p>
             <w:pPr>
@@ -9153,7 +11517,7 @@
         </w:tc>
         <w:tc>
           <w:tcPr>
-            <w:tcW w:type="dxa" w:w="888"/>
+            <w:tcW w:type="dxa" w:w="886"/>
           </w:tcPr>
           <w:p>
             <w:pPr>
@@ -9163,7 +11527,7 @@
               <w:rPr>
                 <w:sz w:val="19"/>
               </w:rPr>
-              <w:t>Day 3</w:t>
+              <w:t>Day 7</w:t>
             </w:r>
           </w:p>
         </w:tc>
@@ -9174,7 +11538,7 @@
         </w:trPr>
         <w:tc>
           <w:tcPr>
-            <w:tcW w:type="dxa" w:w="2770"/>
+            <w:tcW w:type="dxa" w:w="2767"/>
           </w:tcPr>
           <w:p>
             <w:pPr>
@@ -9185,13 +11549,13 @@
                 <w:b/>
                 <w:sz w:val="19"/>
               </w:rPr>
-              <w:t>Emotional bond</w:t>
-            </w:r>
-          </w:p>
-        </w:tc>
-        <w:tc>
-          <w:tcPr>
-            <w:tcW w:type="dxa" w:w="4611"/>
+              <w:t>Design logic</w:t>
+            </w:r>
+          </w:p>
+        </w:tc>
+        <w:tc>
+          <w:tcPr>
+            <w:tcW w:type="dxa" w:w="4630"/>
           </w:tcPr>
           <w:p>
             <w:pPr>
@@ -9201,13 +11565,13 @@
               <w:rPr>
                 <w:sz w:val="19"/>
               </w:rPr>
-              <w:t>The sense, built over time, that a product is on your side. It makes people trust it and come back.</w:t>
-            </w:r>
-          </w:p>
-        </w:tc>
-        <w:tc>
-          <w:tcPr>
-            <w:tcW w:type="dxa" w:w="1369"/>
+              <w:t>A set of decided rules and shared components, such as which colour means what and which type levels exist, used for every screen so everything stays consistent.</w:t>
+            </w:r>
+          </w:p>
+        </w:tc>
+        <w:tc>
+          <w:tcPr>
+            <w:tcW w:type="dxa" w:w="1355"/>
           </w:tcPr>
           <w:p>
             <w:pPr>
@@ -9223,7 +11587,7 @@
         </w:tc>
         <w:tc>
           <w:tcPr>
-            <w:tcW w:type="dxa" w:w="888"/>
+            <w:tcW w:type="dxa" w:w="886"/>
           </w:tcPr>
           <w:p>
             <w:pPr>
@@ -9233,7 +11597,7 @@
               <w:rPr>
                 <w:sz w:val="19"/>
               </w:rPr>
-              <w:t>Day 7</w:t>
+              <w:t>Day 3</w:t>
             </w:r>
           </w:p>
         </w:tc>
@@ -9244,7 +11608,7 @@
         </w:trPr>
         <w:tc>
           <w:tcPr>
-            <w:tcW w:type="dxa" w:w="2770"/>
+            <w:tcW w:type="dxa" w:w="2767"/>
           </w:tcPr>
           <w:p>
             <w:pPr>
@@ -9255,13 +11619,13 @@
                 <w:b/>
                 <w:sz w:val="19"/>
               </w:rPr>
-              <w:t>Emotional factors</w:t>
-            </w:r>
-          </w:p>
-        </w:tc>
-        <w:tc>
-          <w:tcPr>
-            <w:tcW w:type="dxa" w:w="4611"/>
+              <w:t>Emotional bond</w:t>
+            </w:r>
+          </w:p>
+        </w:tc>
+        <w:tc>
+          <w:tcPr>
+            <w:tcW w:type="dxa" w:w="4630"/>
           </w:tcPr>
           <w:p>
             <w:pPr>
@@ -9271,13 +11635,13 @@
               <w:rPr>
                 <w:sz w:val="19"/>
               </w:rPr>
-              <w:t>The feelings that matter most in UX: safety, control, joy, belonging and recognition, and their opposites, frustration and uncertainty.</w:t>
-            </w:r>
-          </w:p>
-        </w:tc>
-        <w:tc>
-          <w:tcPr>
-            <w:tcW w:type="dxa" w:w="1369"/>
+              <w:t>The sense, built over time, that a product is on your side. It makes people trust it and come back.</w:t>
+            </w:r>
+          </w:p>
+        </w:tc>
+        <w:tc>
+          <w:tcPr>
+            <w:tcW w:type="dxa" w:w="1355"/>
           </w:tcPr>
           <w:p>
             <w:pPr>
@@ -9293,7 +11657,7 @@
         </w:tc>
         <w:tc>
           <w:tcPr>
-            <w:tcW w:type="dxa" w:w="888"/>
+            <w:tcW w:type="dxa" w:w="886"/>
           </w:tcPr>
           <w:p>
             <w:pPr>
@@ -9314,7 +11678,7 @@
         </w:trPr>
         <w:tc>
           <w:tcPr>
-            <w:tcW w:type="dxa" w:w="2770"/>
+            <w:tcW w:type="dxa" w:w="2767"/>
           </w:tcPr>
           <w:p>
             <w:pPr>
@@ -9325,13 +11689,13 @@
                 <w:b/>
                 <w:sz w:val="19"/>
               </w:rPr>
-              <w:t>Emotional safety</w:t>
-            </w:r>
-          </w:p>
-        </w:tc>
-        <w:tc>
-          <w:tcPr>
-            <w:tcW w:type="dxa" w:w="4611"/>
+              <w:t>Emotional factors</w:t>
+            </w:r>
+          </w:p>
+        </w:tc>
+        <w:tc>
+          <w:tcPr>
+            <w:tcW w:type="dxa" w:w="4630"/>
           </w:tcPr>
           <w:p>
             <w:pPr>
@@ -9341,13 +11705,13 @@
               <w:rPr>
                 <w:sz w:val="19"/>
               </w:rPr>
-              <w:t>Feeling that you know what is happening, that nothing bad will follow from a mistake, and that help is there.</w:t>
-            </w:r>
-          </w:p>
-        </w:tc>
-        <w:tc>
-          <w:tcPr>
-            <w:tcW w:type="dxa" w:w="1369"/>
+              <w:t>The feelings that matter most in UX: safety, control, joy, belonging and recognition, and their opposites, frustration and uncertainty.</w:t>
+            </w:r>
+          </w:p>
+        </w:tc>
+        <w:tc>
+          <w:tcPr>
+            <w:tcW w:type="dxa" w:w="1355"/>
           </w:tcPr>
           <w:p>
             <w:pPr>
@@ -9363,7 +11727,7 @@
         </w:tc>
         <w:tc>
           <w:tcPr>
-            <w:tcW w:type="dxa" w:w="888"/>
+            <w:tcW w:type="dxa" w:w="886"/>
           </w:tcPr>
           <w:p>
             <w:pPr>
@@ -9384,7 +11748,7 @@
         </w:trPr>
         <w:tc>
           <w:tcPr>
-            <w:tcW w:type="dxa" w:w="2770"/>
+            <w:tcW w:type="dxa" w:w="2767"/>
           </w:tcPr>
           <w:p>
             <w:pPr>
@@ -9395,13 +11759,13 @@
                 <w:b/>
                 <w:sz w:val="19"/>
               </w:rPr>
-              <w:t>Experience quality</w:t>
-            </w:r>
-          </w:p>
-        </w:tc>
-        <w:tc>
-          <w:tcPr>
-            <w:tcW w:type="dxa" w:w="4611"/>
+              <w:t>Emotional safety</w:t>
+            </w:r>
+          </w:p>
+        </w:tc>
+        <w:tc>
+          <w:tcPr>
+            <w:tcW w:type="dxa" w:w="4630"/>
           </w:tcPr>
           <w:p>
             <w:pPr>
@@ -9411,13 +11775,13 @@
               <w:rPr>
                 <w:sz w:val="19"/>
               </w:rPr>
-              <w:t>How using a product feels, on the way and afterwards. It goes beyond usability, which only asks whether people reach their goal.</w:t>
-            </w:r>
-          </w:p>
-        </w:tc>
-        <w:tc>
-          <w:tcPr>
-            <w:tcW w:type="dxa" w:w="1369"/>
+              <w:t>Feeling that you know what is happening, that nothing bad will follow from a mistake, and that help is there.</w:t>
+            </w:r>
+          </w:p>
+        </w:tc>
+        <w:tc>
+          <w:tcPr>
+            <w:tcW w:type="dxa" w:w="1355"/>
           </w:tcPr>
           <w:p>
             <w:pPr>
@@ -9433,7 +11797,7 @@
         </w:tc>
         <w:tc>
           <w:tcPr>
-            <w:tcW w:type="dxa" w:w="888"/>
+            <w:tcW w:type="dxa" w:w="886"/>
           </w:tcPr>
           <w:p>
             <w:pPr>
@@ -9454,7 +11818,7 @@
         </w:trPr>
         <w:tc>
           <w:tcPr>
-            <w:tcW w:type="dxa" w:w="2770"/>
+            <w:tcW w:type="dxa" w:w="2767"/>
           </w:tcPr>
           <w:p>
             <w:pPr>
@@ -9465,13 +11829,13 @@
                 <w:b/>
                 <w:sz w:val="19"/>
               </w:rPr>
-              <w:t>Feedback</w:t>
-            </w:r>
-          </w:p>
-        </w:tc>
-        <w:tc>
-          <w:tcPr>
-            <w:tcW w:type="dxa" w:w="4611"/>
+              <w:t>Experience quality</w:t>
+            </w:r>
+          </w:p>
+        </w:tc>
+        <w:tc>
+          <w:tcPr>
+            <w:tcW w:type="dxa" w:w="4630"/>
           </w:tcPr>
           <w:p>
             <w:pPr>
@@ -9481,13 +11845,13 @@
               <w:rPr>
                 <w:sz w:val="19"/>
               </w:rPr>
-              <w:t>What the system tells people after they act: that a step worked, what happens next, or what went wrong and how to fix it.</w:t>
-            </w:r>
-          </w:p>
-        </w:tc>
-        <w:tc>
-          <w:tcPr>
-            <w:tcW w:type="dxa" w:w="1369"/>
+              <w:t>How using a product feels, on the way and afterwards. It goes beyond usability, which only asks whether people reach their goal.</w:t>
+            </w:r>
+          </w:p>
+        </w:tc>
+        <w:tc>
+          <w:tcPr>
+            <w:tcW w:type="dxa" w:w="1355"/>
           </w:tcPr>
           <w:p>
             <w:pPr>
@@ -9503,7 +11867,7 @@
         </w:tc>
         <w:tc>
           <w:tcPr>
-            <w:tcW w:type="dxa" w:w="888"/>
+            <w:tcW w:type="dxa" w:w="886"/>
           </w:tcPr>
           <w:p>
             <w:pPr>
@@ -9513,7 +11877,7 @@
               <w:rPr>
                 <w:sz w:val="19"/>
               </w:rPr>
-              <w:t>Day 4</w:t>
+              <w:t>Day 7</w:t>
             </w:r>
           </w:p>
         </w:tc>
@@ -9524,7 +11888,7 @@
         </w:trPr>
         <w:tc>
           <w:tcPr>
-            <w:tcW w:type="dxa" w:w="2770"/>
+            <w:tcW w:type="dxa" w:w="2767"/>
           </w:tcPr>
           <w:p>
             <w:pPr>
@@ -9535,13 +11899,13 @@
                 <w:b/>
                 <w:sz w:val="19"/>
               </w:rPr>
-              <w:t>Governance</w:t>
-            </w:r>
-          </w:p>
-        </w:tc>
-        <w:tc>
-          <w:tcPr>
-            <w:tcW w:type="dxa" w:w="4611"/>
+              <w:t>Feedback</w:t>
+            </w:r>
+          </w:p>
+        </w:tc>
+        <w:tc>
+          <w:tcPr>
+            <w:tcW w:type="dxa" w:w="4630"/>
           </w:tcPr>
           <w:p>
             <w:pPr>
@@ -9551,13 +11915,13 @@
               <w:rPr>
                 <w:sz w:val="19"/>
               </w:rPr>
-              <w:t>The rules about who may decide what, who is answerable for it and how disagreements are settled.</w:t>
-            </w:r>
-          </w:p>
-        </w:tc>
-        <w:tc>
-          <w:tcPr>
-            <w:tcW w:type="dxa" w:w="1369"/>
+              <w:t>What the system tells people after they act: that a step worked, what happens next, or what went wrong and how to fix it.</w:t>
+            </w:r>
+          </w:p>
+        </w:tc>
+        <w:tc>
+          <w:tcPr>
+            <w:tcW w:type="dxa" w:w="1355"/>
           </w:tcPr>
           <w:p>
             <w:pPr>
@@ -9573,7 +11937,7 @@
         </w:tc>
         <w:tc>
           <w:tcPr>
-            <w:tcW w:type="dxa" w:w="888"/>
+            <w:tcW w:type="dxa" w:w="886"/>
           </w:tcPr>
           <w:p>
             <w:pPr>
@@ -9583,7 +11947,7 @@
               <w:rPr>
                 <w:sz w:val="19"/>
               </w:rPr>
-              <w:t>Day 1</w:t>
+              <w:t>Day 4</w:t>
             </w:r>
           </w:p>
         </w:tc>
@@ -9594,7 +11958,7 @@
         </w:trPr>
         <w:tc>
           <w:tcPr>
-            <w:tcW w:type="dxa" w:w="2770"/>
+            <w:tcW w:type="dxa" w:w="2767"/>
           </w:tcPr>
           <w:p>
             <w:pPr>
@@ -9605,13 +11969,13 @@
                 <w:b/>
                 <w:sz w:val="19"/>
               </w:rPr>
-              <w:t>Hypothesis</w:t>
-            </w:r>
-          </w:p>
-        </w:tc>
-        <w:tc>
-          <w:tcPr>
-            <w:tcW w:type="dxa" w:w="4611"/>
+              <w:t>Governance</w:t>
+            </w:r>
+          </w:p>
+        </w:tc>
+        <w:tc>
+          <w:tcPr>
+            <w:tcW w:type="dxa" w:w="4630"/>
           </w:tcPr>
           <w:p>
             <w:pPr>
@@ -9621,13 +11985,13 @@
               <w:rPr>
                 <w:sz w:val="19"/>
               </w:rPr>
-              <w:t>An assumption you could check later. “This red banner could make users uneasy” is a hypothesis; “this banner is bad” is only an opinion.</w:t>
-            </w:r>
-          </w:p>
-        </w:tc>
-        <w:tc>
-          <w:tcPr>
-            <w:tcW w:type="dxa" w:w="1369"/>
+              <w:t>The rules about who may decide what, who is answerable for it and how disagreements are settled.</w:t>
+            </w:r>
+          </w:p>
+        </w:tc>
+        <w:tc>
+          <w:tcPr>
+            <w:tcW w:type="dxa" w:w="1355"/>
           </w:tcPr>
           <w:p>
             <w:pPr>
@@ -9643,7 +12007,7 @@
         </w:tc>
         <w:tc>
           <w:tcPr>
-            <w:tcW w:type="dxa" w:w="888"/>
+            <w:tcW w:type="dxa" w:w="886"/>
           </w:tcPr>
           <w:p>
             <w:pPr>
@@ -9664,7 +12028,7 @@
         </w:trPr>
         <w:tc>
           <w:tcPr>
-            <w:tcW w:type="dxa" w:w="2770"/>
+            <w:tcW w:type="dxa" w:w="2767"/>
           </w:tcPr>
           <w:p>
             <w:pPr>
@@ -9675,13 +12039,13 @@
                 <w:b/>
                 <w:sz w:val="19"/>
               </w:rPr>
-              <w:t>Incongruent address</w:t>
-            </w:r>
-          </w:p>
-        </w:tc>
-        <w:tc>
-          <w:tcPr>
-            <w:tcW w:type="dxa" w:w="4611"/>
+              <w:t>Hypothesis</w:t>
+            </w:r>
+          </w:p>
+        </w:tc>
+        <w:tc>
+          <w:tcPr>
+            <w:tcW w:type="dxa" w:w="4630"/>
           </w:tcPr>
           <w:p>
             <w:pPr>
@@ -9691,13 +12055,13 @@
               <w:rPr>
                 <w:sz w:val="19"/>
               </w:rPr>
-              <w:t>A feeling that does not fit the situation, such as a cheerful tone about a worry or a fault.</w:t>
-            </w:r>
-          </w:p>
-        </w:tc>
-        <w:tc>
-          <w:tcPr>
-            <w:tcW w:type="dxa" w:w="1369"/>
+              <w:t>An assumption you could check later. “This red banner could make users uneasy” is a hypothesis; “this banner is bad” is only an opinion.</w:t>
+            </w:r>
+          </w:p>
+        </w:tc>
+        <w:tc>
+          <w:tcPr>
+            <w:tcW w:type="dxa" w:w="1355"/>
           </w:tcPr>
           <w:p>
             <w:pPr>
@@ -9713,7 +12077,7 @@
         </w:tc>
         <w:tc>
           <w:tcPr>
-            <w:tcW w:type="dxa" w:w="888"/>
+            <w:tcW w:type="dxa" w:w="886"/>
           </w:tcPr>
           <w:p>
             <w:pPr>
@@ -9723,7 +12087,7 @@
               <w:rPr>
                 <w:sz w:val="19"/>
               </w:rPr>
-              <w:t>Day 7</w:t>
+              <w:t>Day 1</w:t>
             </w:r>
           </w:p>
         </w:tc>
@@ -9734,7 +12098,7 @@
         </w:trPr>
         <w:tc>
           <w:tcPr>
-            <w:tcW w:type="dxa" w:w="2770"/>
+            <w:tcW w:type="dxa" w:w="2767"/>
           </w:tcPr>
           <w:p>
             <w:pPr>
@@ -9745,13 +12109,13 @@
                 <w:b/>
                 <w:sz w:val="19"/>
               </w:rPr>
-              <w:t>Microcopy</w:t>
-            </w:r>
-          </w:p>
-        </w:tc>
-        <w:tc>
-          <w:tcPr>
-            <w:tcW w:type="dxa" w:w="4611"/>
+              <w:t>Incongruent address</w:t>
+            </w:r>
+          </w:p>
+        </w:tc>
+        <w:tc>
+          <w:tcPr>
+            <w:tcW w:type="dxa" w:w="4630"/>
           </w:tcPr>
           <w:p>
             <w:pPr>
@@ -9761,13 +12125,13 @@
               <w:rPr>
                 <w:sz w:val="19"/>
               </w:rPr>
-              <w:t>The small pieces of text in an interface: button labels, hints, error messages and the lines around an upload.</w:t>
-            </w:r>
-          </w:p>
-        </w:tc>
-        <w:tc>
-          <w:tcPr>
-            <w:tcW w:type="dxa" w:w="1369"/>
+              <w:t>A feeling that does not fit the situation, such as a cheerful tone about a worry or a fault.</w:t>
+            </w:r>
+          </w:p>
+        </w:tc>
+        <w:tc>
+          <w:tcPr>
+            <w:tcW w:type="dxa" w:w="1355"/>
           </w:tcPr>
           <w:p>
             <w:pPr>
@@ -9783,7 +12147,7 @@
         </w:tc>
         <w:tc>
           <w:tcPr>
-            <w:tcW w:type="dxa" w:w="888"/>
+            <w:tcW w:type="dxa" w:w="886"/>
           </w:tcPr>
           <w:p>
             <w:pPr>
@@ -9793,7 +12157,7 @@
               <w:rPr>
                 <w:sz w:val="19"/>
               </w:rPr>
-              <w:t>Day 1</w:t>
+              <w:t>Day 7</w:t>
             </w:r>
           </w:p>
         </w:tc>
@@ -9804,7 +12168,7 @@
         </w:trPr>
         <w:tc>
           <w:tcPr>
-            <w:tcW w:type="dxa" w:w="2770"/>
+            <w:tcW w:type="dxa" w:w="2767"/>
           </w:tcPr>
           <w:p>
             <w:pPr>
@@ -9815,13 +12179,13 @@
                 <w:b/>
                 <w:sz w:val="19"/>
               </w:rPr>
-              <w:t>Neuro-UX</w:t>
-            </w:r>
-          </w:p>
-        </w:tc>
-        <w:tc>
-          <w:tcPr>
-            <w:tcW w:type="dxa" w:w="4611"/>
+              <w:t>Microcopy</w:t>
+            </w:r>
+          </w:p>
+        </w:tc>
+        <w:tc>
+          <w:tcPr>
+            <w:tcW w:type="dxa" w:w="4630"/>
           </w:tcPr>
           <w:p>
             <w:pPr>
@@ -9831,13 +12195,13 @@
               <w:rPr>
                 <w:sz w:val="19"/>
               </w:rPr>
-              <w:t>Designing an interface with knowledge of how the brain sees, attends, feels and decides, so that the design steers these processes on purpose and responsibly.</w:t>
-            </w:r>
-          </w:p>
-        </w:tc>
-        <w:tc>
-          <w:tcPr>
-            <w:tcW w:type="dxa" w:w="1369"/>
+              <w:t>The small pieces of text in an interface: button labels, hints, error messages and the lines around an upload.</w:t>
+            </w:r>
+          </w:p>
+        </w:tc>
+        <w:tc>
+          <w:tcPr>
+            <w:tcW w:type="dxa" w:w="1355"/>
           </w:tcPr>
           <w:p>
             <w:pPr>
@@ -9853,7 +12217,7 @@
         </w:tc>
         <w:tc>
           <w:tcPr>
-            <w:tcW w:type="dxa" w:w="888"/>
+            <w:tcW w:type="dxa" w:w="886"/>
           </w:tcPr>
           <w:p>
             <w:pPr>
@@ -9874,7 +12238,7 @@
         </w:trPr>
         <w:tc>
           <w:tcPr>
-            <w:tcW w:type="dxa" w:w="2770"/>
+            <w:tcW w:type="dxa" w:w="2767"/>
           </w:tcPr>
           <w:p>
             <w:pPr>
@@ -9885,13 +12249,13 @@
                 <w:b/>
                 <w:sz w:val="19"/>
               </w:rPr>
-              <w:t>Over-emotionalisation</w:t>
-            </w:r>
-          </w:p>
-        </w:tc>
-        <w:tc>
-          <w:tcPr>
-            <w:tcW w:type="dxa" w:w="4611"/>
+              <w:t>Neuro-UX</w:t>
+            </w:r>
+          </w:p>
+        </w:tc>
+        <w:tc>
+          <w:tcPr>
+            <w:tcW w:type="dxa" w:w="4630"/>
           </w:tcPr>
           <w:p>
             <w:pPr>
@@ -9901,13 +12265,13 @@
               <w:rPr>
                 <w:sz w:val="19"/>
               </w:rPr>
-              <w:t>More feeling than the situation carries: exclamation marks, confetti or warmth where people need calm facts.</w:t>
-            </w:r>
-          </w:p>
-        </w:tc>
-        <w:tc>
-          <w:tcPr>
-            <w:tcW w:type="dxa" w:w="1369"/>
+              <w:t>Designing an interface with knowledge of how the brain sees, attends, feels and decides, so that the design steers these processes on purpose and responsibly.</w:t>
+            </w:r>
+          </w:p>
+        </w:tc>
+        <w:tc>
+          <w:tcPr>
+            <w:tcW w:type="dxa" w:w="1355"/>
           </w:tcPr>
           <w:p>
             <w:pPr>
@@ -9923,7 +12287,7 @@
         </w:tc>
         <w:tc>
           <w:tcPr>
-            <w:tcW w:type="dxa" w:w="888"/>
+            <w:tcW w:type="dxa" w:w="886"/>
           </w:tcPr>
           <w:p>
             <w:pPr>
@@ -9933,7 +12297,7 @@
               <w:rPr>
                 <w:sz w:val="19"/>
               </w:rPr>
-              <w:t>Day 7</w:t>
+              <w:t>Day 1</w:t>
             </w:r>
           </w:p>
         </w:tc>
@@ -9944,7 +12308,7 @@
         </w:trPr>
         <w:tc>
           <w:tcPr>
-            <w:tcW w:type="dxa" w:w="2770"/>
+            <w:tcW w:type="dxa" w:w="2767"/>
           </w:tcPr>
           <w:p>
             <w:pPr>
@@ -9955,13 +12319,13 @@
                 <w:b/>
                 <w:sz w:val="19"/>
               </w:rPr>
-              <w:t>Peak-end rule</w:t>
-            </w:r>
-          </w:p>
-        </w:tc>
-        <w:tc>
-          <w:tcPr>
-            <w:tcW w:type="dxa" w:w="4611"/>
+              <w:t>Over-emotionalisation</w:t>
+            </w:r>
+          </w:p>
+        </w:tc>
+        <w:tc>
+          <w:tcPr>
+            <w:tcW w:type="dxa" w:w="4630"/>
           </w:tcPr>
           <w:p>
             <w:pPr>
@@ -9971,13 +12335,13 @@
               <w:rPr>
                 <w:sz w:val="19"/>
               </w:rPr>
-              <w:t>People remember an experience mostly by its strongest moment and how it ended, not by its average.</w:t>
-            </w:r>
-          </w:p>
-        </w:tc>
-        <w:tc>
-          <w:tcPr>
-            <w:tcW w:type="dxa" w:w="1369"/>
+              <w:t>More feeling than the situation carries: exclamation marks, confetti or warmth where people need calm facts.</w:t>
+            </w:r>
+          </w:p>
+        </w:tc>
+        <w:tc>
+          <w:tcPr>
+            <w:tcW w:type="dxa" w:w="1355"/>
           </w:tcPr>
           <w:p>
             <w:pPr>
@@ -9993,7 +12357,7 @@
         </w:tc>
         <w:tc>
           <w:tcPr>
-            <w:tcW w:type="dxa" w:w="888"/>
+            <w:tcW w:type="dxa" w:w="886"/>
           </w:tcPr>
           <w:p>
             <w:pPr>
@@ -10014,7 +12378,7 @@
         </w:trPr>
         <w:tc>
           <w:tcPr>
-            <w:tcW w:type="dxa" w:w="2770"/>
+            <w:tcW w:type="dxa" w:w="2767"/>
           </w:tcPr>
           <w:p>
             <w:pPr>
@@ -10025,13 +12389,13 @@
                 <w:b/>
                 <w:sz w:val="19"/>
               </w:rPr>
-              <w:t>Perceived competence</w:t>
-            </w:r>
-          </w:p>
-        </w:tc>
-        <w:tc>
-          <w:tcPr>
-            <w:tcW w:type="dxa" w:w="4611"/>
+              <w:t>Peak-end rule</w:t>
+            </w:r>
+          </w:p>
+        </w:tc>
+        <w:tc>
+          <w:tcPr>
+            <w:tcW w:type="dxa" w:w="4630"/>
           </w:tcPr>
           <w:p>
             <w:pPr>
@@ -10041,13 +12405,13 @@
               <w:rPr>
                 <w:sz w:val="19"/>
               </w:rPr>
-              <w:t>How capable a product or company seems to people, judged from small signals such as clear feedback and careful wording.</w:t>
-            </w:r>
-          </w:p>
-        </w:tc>
-        <w:tc>
-          <w:tcPr>
-            <w:tcW w:type="dxa" w:w="1369"/>
+              <w:t>People remember an experience mostly by its strongest moment and how it ended, not by its average.</w:t>
+            </w:r>
+          </w:p>
+        </w:tc>
+        <w:tc>
+          <w:tcPr>
+            <w:tcW w:type="dxa" w:w="1355"/>
           </w:tcPr>
           <w:p>
             <w:pPr>
@@ -10063,7 +12427,7 @@
         </w:tc>
         <w:tc>
           <w:tcPr>
-            <w:tcW w:type="dxa" w:w="888"/>
+            <w:tcW w:type="dxa" w:w="886"/>
           </w:tcPr>
           <w:p>
             <w:pPr>
@@ -10084,7 +12448,7 @@
         </w:trPr>
         <w:tc>
           <w:tcPr>
-            <w:tcW w:type="dxa" w:w="2770"/>
+            <w:tcW w:type="dxa" w:w="2767"/>
           </w:tcPr>
           <w:p>
             <w:pPr>
@@ -10095,13 +12459,13 @@
                 <w:b/>
                 <w:sz w:val="19"/>
               </w:rPr>
-              <w:t>Tone guide</w:t>
-            </w:r>
-          </w:p>
-        </w:tc>
-        <w:tc>
-          <w:tcPr>
-            <w:tcW w:type="dxa" w:w="4611"/>
+              <w:t>Perceived competence</w:t>
+            </w:r>
+          </w:p>
+        </w:tc>
+        <w:tc>
+          <w:tcPr>
+            <w:tcW w:type="dxa" w:w="4630"/>
           </w:tcPr>
           <w:p>
             <w:pPr>
@@ -10111,13 +12475,13 @@
               <w:rPr>
                 <w:sz w:val="19"/>
               </w:rPr>
-              <w:t>A short written rule for how a product speaks: which words, how formal, how it sounds when something goes wrong.</w:t>
-            </w:r>
-          </w:p>
-        </w:tc>
-        <w:tc>
-          <w:tcPr>
-            <w:tcW w:type="dxa" w:w="1369"/>
+              <w:t>How capable a product or company seems to people, judged from small signals such as clear feedback and careful wording.</w:t>
+            </w:r>
+          </w:p>
+        </w:tc>
+        <w:tc>
+          <w:tcPr>
+            <w:tcW w:type="dxa" w:w="1355"/>
           </w:tcPr>
           <w:p>
             <w:pPr>
@@ -10133,7 +12497,7 @@
         </w:tc>
         <w:tc>
           <w:tcPr>
-            <w:tcW w:type="dxa" w:w="888"/>
+            <w:tcW w:type="dxa" w:w="886"/>
           </w:tcPr>
           <w:p>
             <w:pPr>
@@ -10154,7 +12518,7 @@
         </w:trPr>
         <w:tc>
           <w:tcPr>
-            <w:tcW w:type="dxa" w:w="2770"/>
+            <w:tcW w:type="dxa" w:w="2767"/>
           </w:tcPr>
           <w:p>
             <w:pPr>
@@ -10165,13 +12529,13 @@
                 <w:b/>
                 <w:sz w:val="19"/>
               </w:rPr>
-              <w:t>Touchpoint</w:t>
-            </w:r>
-          </w:p>
-        </w:tc>
-        <w:tc>
-          <w:tcPr>
-            <w:tcW w:type="dxa" w:w="4611"/>
+              <w:t>Tone guide</w:t>
+            </w:r>
+          </w:p>
+        </w:tc>
+        <w:tc>
+          <w:tcPr>
+            <w:tcW w:type="dxa" w:w="4630"/>
           </w:tcPr>
           <w:p>
             <w:pPr>
@@ -10181,13 +12545,13 @@
               <w:rPr>
                 <w:sz w:val="19"/>
               </w:rPr>
-              <w:t>Any place where a person meets the company: the website, the customer portal, the app, a chatbot or a phone call.</w:t>
-            </w:r>
-          </w:p>
-        </w:tc>
-        <w:tc>
-          <w:tcPr>
-            <w:tcW w:type="dxa" w:w="1369"/>
+              <w:t>A short written rule for how a product speaks: which words, how formal, how it sounds when something goes wrong.</w:t>
+            </w:r>
+          </w:p>
+        </w:tc>
+        <w:tc>
+          <w:tcPr>
+            <w:tcW w:type="dxa" w:w="1355"/>
           </w:tcPr>
           <w:p>
             <w:pPr>
@@ -10203,7 +12567,7 @@
         </w:tc>
         <w:tc>
           <w:tcPr>
-            <w:tcW w:type="dxa" w:w="888"/>
+            <w:tcW w:type="dxa" w:w="886"/>
           </w:tcPr>
           <w:p>
             <w:pPr>
@@ -10213,7 +12577,7 @@
               <w:rPr>
                 <w:sz w:val="19"/>
               </w:rPr>
-              <w:t>Day 1</w:t>
+              <w:t>Day 7</w:t>
             </w:r>
           </w:p>
         </w:tc>
@@ -10224,7 +12588,7 @@
         </w:trPr>
         <w:tc>
           <w:tcPr>
-            <w:tcW w:type="dxa" w:w="2770"/>
+            <w:tcW w:type="dxa" w:w="2767"/>
           </w:tcPr>
           <w:p>
             <w:pPr>
@@ -10235,13 +12599,83 @@
                 <w:b/>
                 <w:sz w:val="19"/>
               </w:rPr>
+              <w:t>Touchpoint</w:t>
+            </w:r>
+          </w:p>
+        </w:tc>
+        <w:tc>
+          <w:tcPr>
+            <w:tcW w:type="dxa" w:w="4630"/>
+          </w:tcPr>
+          <w:p>
+            <w:pPr>
+              <w:spacing w:before="0" w:after="0"/>
+            </w:pPr>
+            <w:r>
+              <w:rPr>
+                <w:sz w:val="19"/>
+              </w:rPr>
+              <w:t>Any place where a person meets the company: the website, the customer portal, the app, a chatbot or a phone call.</w:t>
+            </w:r>
+          </w:p>
+        </w:tc>
+        <w:tc>
+          <w:tcPr>
+            <w:tcW w:type="dxa" w:w="1355"/>
+          </w:tcPr>
+          <w:p>
+            <w:pPr>
+              <w:spacing w:before="0" w:after="0"/>
+            </w:pPr>
+            <w:r>
+              <w:rPr>
+                <w:sz w:val="19"/>
+              </w:rPr>
+              <w:t>—</w:t>
+            </w:r>
+          </w:p>
+        </w:tc>
+        <w:tc>
+          <w:tcPr>
+            <w:tcW w:type="dxa" w:w="886"/>
+          </w:tcPr>
+          <w:p>
+            <w:pPr>
+              <w:spacing w:before="0" w:after="0"/>
+            </w:pPr>
+            <w:r>
+              <w:rPr>
+                <w:sz w:val="19"/>
+              </w:rPr>
+              <w:t>Day 1</w:t>
+            </w:r>
+          </w:p>
+        </w:tc>
+      </w:tr>
+      <w:tr>
+        <w:trPr>
+          <w:cantSplit/>
+        </w:trPr>
+        <w:tc>
+          <w:tcPr>
+            <w:tcW w:type="dxa" w:w="2767"/>
+          </w:tcPr>
+          <w:p>
+            <w:pPr>
+              <w:spacing w:before="0" w:after="0"/>
+            </w:pPr>
+            <w:r>
+              <w:rPr>
+                <w:b/>
+                <w:sz w:val="19"/>
+              </w:rPr>
               <w:t>UX (user experience)</w:t>
             </w:r>
           </w:p>
         </w:tc>
         <w:tc>
           <w:tcPr>
-            <w:tcW w:type="dxa" w:w="4611"/>
+            <w:tcW w:type="dxa" w:w="4630"/>
           </w:tcPr>
           <w:p>
             <w:pPr>
@@ -10257,7 +12691,7 @@
         </w:tc>
         <w:tc>
           <w:tcPr>
-            <w:tcW w:type="dxa" w:w="1369"/>
+            <w:tcW w:type="dxa" w:w="1355"/>
           </w:tcPr>
           <w:p>
             <w:pPr>
@@ -10273,7 +12707,77 @@
         </w:tc>
         <w:tc>
           <w:tcPr>
-            <w:tcW w:type="dxa" w:w="888"/>
+            <w:tcW w:type="dxa" w:w="886"/>
+          </w:tcPr>
+          <w:p>
+            <w:pPr>
+              <w:spacing w:before="0" w:after="0"/>
+            </w:pPr>
+            <w:r>
+              <w:rPr>
+                <w:sz w:val="19"/>
+              </w:rPr>
+              <w:t>Day 1</w:t>
+            </w:r>
+          </w:p>
+        </w:tc>
+      </w:tr>
+      <w:tr>
+        <w:trPr>
+          <w:cantSplit/>
+        </w:trPr>
+        <w:tc>
+          <w:tcPr>
+            <w:tcW w:type="dxa" w:w="2767"/>
+          </w:tcPr>
+          <w:p>
+            <w:pPr>
+              <w:spacing w:before="0" w:after="0"/>
+            </w:pPr>
+            <w:r>
+              <w:rPr>
+                <w:b/>
+                <w:sz w:val="19"/>
+              </w:rPr>
+              <w:t>Visual hierarchy</w:t>
+            </w:r>
+          </w:p>
+        </w:tc>
+        <w:tc>
+          <w:tcPr>
+            <w:tcW w:type="dxa" w:w="4630"/>
+          </w:tcPr>
+          <w:p>
+            <w:pPr>
+              <w:spacing w:before="0" w:after="0"/>
+            </w:pPr>
+            <w:r>
+              <w:rPr>
+                <w:sz w:val="19"/>
+              </w:rPr>
+              <w:t>An order the eye can follow: the most important thing is clearly the strongest, the rest is quieter. Without it, everything competes equally.</w:t>
+            </w:r>
+          </w:p>
+        </w:tc>
+        <w:tc>
+          <w:tcPr>
+            <w:tcW w:type="dxa" w:w="1355"/>
+          </w:tcPr>
+          <w:p>
+            <w:pPr>
+              <w:spacing w:before="0" w:after="0"/>
+            </w:pPr>
+            <w:r>
+              <w:rPr>
+                <w:sz w:val="19"/>
+              </w:rPr>
+              <w:t>—</w:t>
+            </w:r>
+          </w:p>
+        </w:tc>
+        <w:tc>
+          <w:tcPr>
+            <w:tcW w:type="dxa" w:w="886"/>
           </w:tcPr>
           <w:p>
             <w:pPr>

</xml_diff>